<commit_message>
Atualiza manuais e apresentacao com os registros de cotacoes e o grafico compra x alvo
Co-Authored-By: Claude Opus 5.5 <noreply@anthropic.com>
</commit_message>
<xml_diff>
--- a/docs/Manual_Comercial_BolsaTrader.docx
+++ b/docs/Manual_Comercial_BolsaTrader.docx
@@ -73,7 +73,7 @@
           <w:color w:val="5A6474"/>
           <w:sz w:val="20"/>
         </w:rPr>
-        <w:t>Versão do manual: setembro de 2026 — revisão de 25/09/2026 (Scanner Técnico avançado, Análise da B3 hoje por IA e Conta Corrente)</w:t>
+        <w:t>Versão do manual: outubro de 2026 — revisão de 09/10/2026 (Registros de cotações dos ativos comprados e gráfico compra x alvo em popup)</w:t>
       </w:r>
     </w:p>
     <w:p>
@@ -271,6 +271,14 @@
       </w:r>
     </w:p>
     <w:p>
+      <w:pPr>
+        <w:pStyle w:val="ListBullet"/>
+      </w:pPr>
+      <w:r>
+        <w:t>Registro automático das cotações dos ativos comprados ao longo do dia (ativo, data, hora e valor), com gráfico em popup que compara a evolução da cotação com o preço de compra e o preço alvo de cada posição.</w:t>
+      </w:r>
+    </w:p>
+    <w:p>
       <w:r>
         <w:br w:type="page"/>
       </w:r>
@@ -429,6 +437,14 @@
       </w:pPr>
       <w:r>
         <w:t>Gráfico de linha comparando o valor de compra (constante) com o valor atual ao longo do histórico de cotações, para cada ativo efetivamente comprado - verde quando em lucro, vermelho quando em perda, com tooltip interativo.</w:t>
+      </w:r>
+    </w:p>
+    <w:p>
+      <w:pPr>
+        <w:pStyle w:val="ListBullet"/>
+      </w:pPr>
+      <w:r>
+        <w:t>Botão 📈 em cada ativo comprado (também no Painel e em Minhas Operações): abre, sem sair da tela, o gráfico das cotações registradas com duas linhas de referência - o preço de compra e o alvo da meta de lucro.</w:t>
       </w:r>
     </w:p>
     <w:p>
@@ -654,6 +670,11 @@
     <w:p>
       <w:r>
         <w:t>Grid com o retrato mais recente da cotação de cada ativo cadastrado: preço atual, variação do dia, máxima e mínima do dia, abertura, fechamento anterior, variação em R$, volume negociado, valor de mercado, moeda e faixa de 52 semanas - tudo em um único lugar, sem precisar visitar vários sites.</w:t>
+      </w:r>
+    </w:p>
+    <w:p>
+      <w:r>
+        <w:t>Registros de cotações: a cada atualização - automática, pelo botão "Atualizar cotações agora" ou por uma consulta avulsa - o sistema grava a cotação de cada ativo em carteira, com data, hora e origem (automática ou manual). Um botão nesta tela mostra a grid com esses registros, por ativo ou de toda a carteira. Ao vender um ativo, o sistema pergunta se os registros dele devem ser mantidos ou excluídos.</w:t>
       </w:r>
     </w:p>
     <w:p>

</xml_diff>

<commit_message>
Atualiza manuais e apresentacao com o comando de voz em portugues
Co-Authored-By: Claude Opus 5.5 <noreply@anthropic.com>
</commit_message>
<xml_diff>
--- a/docs/Manual_Comercial_BolsaTrader.docx
+++ b/docs/Manual_Comercial_BolsaTrader.docx
@@ -73,7 +73,7 @@
           <w:color w:val="5A6474"/>
           <w:sz w:val="20"/>
         </w:rPr>
-        <w:t>Versão do manual: outubro de 2026 — revisão de 09/10/2026 (Registros de cotações dos ativos comprados e gráfico compra x alvo em popup)</w:t>
+        <w:t>Versão do manual: outubro de 2026 — revisão de 10/10/2026 (Comando de voz em português)</w:t>
       </w:r>
     </w:p>
     <w:p>
@@ -276,6 +276,14 @@
       </w:pPr>
       <w:r>
         <w:t>Registro automático das cotações dos ativos comprados ao longo do dia (ativo, data, hora e valor), com gráfico em popup que compara a evolução da cotação com o preço de compra e o preço alvo de cada posição.</w:t>
+      </w:r>
+    </w:p>
+    <w:p>
+      <w:pPr>
+        <w:pStyle w:val="ListBullet"/>
+      </w:pPr>
+      <w:r>
+        <w:t>Comando de voz em português: navegação, atualização de cotações e consulta de tickers falando, sem instalar nada.</w:t>
       </w:r>
     </w:p>
     <w:p>
@@ -805,6 +813,19 @@
       </w:r>
     </w:p>
     <w:p>
+      <w:pPr>
+        <w:pStyle w:val="Heading2"/>
+      </w:pPr>
+      <w:r>
+        <w:t>3.19. Comando de Voz</w:t>
+      </w:r>
+    </w:p>
+    <w:p>
+      <w:r>
+        <w:t>Um botão 🎤 no cabeçalho de todas as telas permite usar o sistema falando em português: "abrir posições", "nova operação", "atualizar cotações", "cotação de PETR4" e dezenas de outros comandos. Funciona direto no navegador (Chrome e Edge, inclusive no celular), sem instalar nada e sem custo de API, com retorno visual do que foi entendido e um comando "ajuda" que lista as opções.</w:t>
+      </w:r>
+    </w:p>
+    <w:p>
       <w:r>
         <w:br w:type="page"/>
       </w:r>

</xml_diff>

<commit_message>
Atualiza manuais e apresentacao com o destaque de noticias por ativo
Co-Authored-By: Claude Opus 5.5 <noreply@anthropic.com>
</commit_message>
<xml_diff>
--- a/docs/Manual_Comercial_BolsaTrader.docx
+++ b/docs/Manual_Comercial_BolsaTrader.docx
@@ -243,7 +243,7 @@
         <w:pStyle w:val="ListBullet"/>
       </w:pPr>
       <w:r>
-        <w:t>Notícias de mercado sincronizadas automaticamente com destaque visual para o que é novo, e fontes 100% configuráveis pelo próprio usuário.</w:t>
+        <w:t>Notícias de mercado sincronizadas automaticamente com destaque visual para o que é novo e para as manchetes de um ativo escolhido, e fontes 100% configuráveis pelo próprio usuário.</w:t>
       </w:r>
     </w:p>
     <w:p>
@@ -651,7 +651,7 @@
     </w:p>
     <w:p>
       <w:r>
-        <w:t>Mural de manchetes de notícias e análises de mercado, com fontes 100% configuráveis pelo próprio usuário (basta cadastrar a URL de qualquer site de notícias). O botão "Atualizar notícias agora" sincroniza as manchetes que o site está exibindo no momento: grava as novas e remove as que saíram do ar - mantendo a lista sempre fiel ao que o site mostra hoje. Manchetes recém-encontradas ficam destacadas com um selo "Nova" na primeira visita após a atualização. Uma fonte pode ser desativada sem perder o histórico já capturado - ela simplesmente some do mural até ser reativada.</w:t>
+        <w:t>Mural de manchetes de notícias e análises de mercado, com fontes 100% configuráveis pelo próprio usuário (basta cadastrar a URL de qualquer site de notícias). O botão "Atualizar notícias agora" sincroniza as manchetes que o site está exibindo no momento: grava as novas e remove as que saíram do ar - mantendo a lista sempre fiel ao que o site mostra hoje. Manchetes recém-encontradas ficam destacadas com um selo "Nova" na primeira visita após a atualização. Uma fonte pode ser desativada sem perder o histórico já capturado - ela simplesmente some do mural até ser reativada. Também é possível informar um ativo (ex.: PETR4, Petrobras): as notícias continuam sendo buscadas normalmente e as manchetes que citam aquele ativo ficam destacadas em amarelo, com a contagem por fonte.</w:t>
       </w:r>
     </w:p>
     <w:p>

</xml_diff>

<commit_message>
Atualiza manuais e apresentacao com risco da carteira e limpeza de noticias
- Manual operacional: 6.6 com grafico de rosca, correlacao e teste de
  estresse; nova 13.5 (limpar todas as noticias); Qualidade das Empresas
  com o novo Limpar consultas; passo novo no roteiro de compra; 3 FAQs
- Manual comercial: diferencial e secao 3.22 (Risco da Carteira)
- Apresentacao: slide novo de correlacao e estresse (30 slides)

Co-Authored-By: Claude Opus 5.5 <noreply@anthropic.com>
</commit_message>
<xml_diff>
--- a/docs/Manual_Comercial_BolsaTrader.docx
+++ b/docs/Manual_Comercial_BolsaTrader.docx
@@ -16,15 +16,7 @@
           <w:color w:val="0D1526"/>
           <w:sz w:val="80"/>
         </w:rPr>
-        <w:t>⚡</w:t>
-      </w:r>
-      <w:r>
-        <w:rPr>
-          <w:b/>
-          <w:color w:val="0D1526"/>
-          <w:sz w:val="80"/>
-        </w:rPr>
-        <w:t xml:space="preserve"> BOLSATRADER</w:t>
+        <w:t>⚡ BOLSATRADER</w:t>
       </w:r>
     </w:p>
     <w:p>
@@ -81,7 +73,7 @@
           <w:color w:val="5A6474"/>
           <w:sz w:val="20"/>
         </w:rPr>
-        <w:t>Versão do manual: outubro de 2026 — revisão de 12/10/2026 (Qualidade das Empresas, Calculadora de risco, Backtesting com referência e reforço de segurança)</w:t>
+        <w:t>Versão do manual: outubro de 2026 — revisão de 14/10/2026 (Correlação e teste de estresse da carteira, gráfico de composição e limpeza do mural de notícias)</w:t>
       </w:r>
     </w:p>
     <w:p>
@@ -106,7 +98,7 @@
       <w:pPr>
         <w:pStyle w:val="Ttulo1"/>
       </w:pPr>
-      <w:bookmarkStart w:id="0" w:name="_Toc242723843"/>
+      <w:bookmarkStart w:id="0" w:name="_Toc242867139"/>
       <w:r>
         <w:lastRenderedPageBreak/>
         <w:t>Sumário</w:t>
@@ -120,7 +112,14 @@
           <w:tab w:val="right" w:leader="dot" w:pos="9396"/>
         </w:tabs>
         <w:rPr>
+          <w:rFonts w:asciiTheme="minorHAnsi" w:hAnsiTheme="minorHAnsi"/>
           <w:noProof/>
+          <w:color w:val="auto"/>
+          <w:kern w:val="2"/>
+          <w:sz w:val="24"/>
+          <w:szCs w:val="24"/>
+          <w:lang w:val="pt-BR" w:eastAsia="pt-BR"/>
+          <w14:ligatures w14:val="standardContextual"/>
         </w:rPr>
       </w:pPr>
       <w:r>
@@ -132,7 +131,7 @@
       <w:r>
         <w:fldChar w:fldCharType="separate"/>
       </w:r>
-      <w:hyperlink w:anchor="_Toc242723843" w:history="1">
+      <w:hyperlink w:anchor="_Toc242867139" w:history="1">
         <w:r>
           <w:rPr>
             <w:rStyle w:val="Hyperlink"/>
@@ -159,7 +158,7 @@
             <w:noProof/>
             <w:webHidden/>
           </w:rPr>
-          <w:instrText xml:space="preserve"> PAGEREF _Toc242723843 \h </w:instrText>
+          <w:instrText xml:space="preserve"> PAGEREF _Toc242867139 \h </w:instrText>
         </w:r>
         <w:r>
           <w:rPr>
@@ -197,10 +196,17 @@
           <w:tab w:val="right" w:leader="dot" w:pos="9396"/>
         </w:tabs>
         <w:rPr>
+          <w:rFonts w:asciiTheme="minorHAnsi" w:hAnsiTheme="minorHAnsi"/>
           <w:noProof/>
+          <w:color w:val="auto"/>
+          <w:kern w:val="2"/>
+          <w:sz w:val="24"/>
+          <w:szCs w:val="24"/>
+          <w:lang w:val="pt-BR" w:eastAsia="pt-BR"/>
+          <w14:ligatures w14:val="standardContextual"/>
         </w:rPr>
       </w:pPr>
-      <w:hyperlink w:anchor="_Toc242723844" w:history="1">
+      <w:hyperlink w:anchor="_Toc242867140" w:history="1">
         <w:r>
           <w:rPr>
             <w:rStyle w:val="Hyperlink"/>
@@ -227,7 +233,7 @@
             <w:noProof/>
             <w:webHidden/>
           </w:rPr>
-          <w:instrText xml:space="preserve"> PAGEREF _Toc242723844 \h </w:instrText>
+          <w:instrText xml:space="preserve"> PAGEREF _Toc242867140 \h </w:instrText>
         </w:r>
         <w:r>
           <w:rPr>
@@ -265,10 +271,17 @@
           <w:tab w:val="right" w:leader="dot" w:pos="9396"/>
         </w:tabs>
         <w:rPr>
+          <w:rFonts w:asciiTheme="minorHAnsi" w:hAnsiTheme="minorHAnsi"/>
           <w:noProof/>
+          <w:color w:val="auto"/>
+          <w:kern w:val="2"/>
+          <w:sz w:val="24"/>
+          <w:szCs w:val="24"/>
+          <w:lang w:val="pt-BR" w:eastAsia="pt-BR"/>
+          <w14:ligatures w14:val="standardContextual"/>
         </w:rPr>
       </w:pPr>
-      <w:hyperlink w:anchor="_Toc242723845" w:history="1">
+      <w:hyperlink w:anchor="_Toc242867141" w:history="1">
         <w:r>
           <w:rPr>
             <w:rStyle w:val="Hyperlink"/>
@@ -295,7 +308,7 @@
             <w:noProof/>
             <w:webHidden/>
           </w:rPr>
-          <w:instrText xml:space="preserve"> PAGEREF _Toc242723845 \h </w:instrText>
+          <w:instrText xml:space="preserve"> PAGEREF _Toc242867141 \h </w:instrText>
         </w:r>
         <w:r>
           <w:rPr>
@@ -333,10 +346,17 @@
           <w:tab w:val="right" w:leader="dot" w:pos="9396"/>
         </w:tabs>
         <w:rPr>
+          <w:rFonts w:asciiTheme="minorHAnsi" w:hAnsiTheme="minorHAnsi"/>
           <w:noProof/>
+          <w:color w:val="auto"/>
+          <w:kern w:val="2"/>
+          <w:sz w:val="24"/>
+          <w:szCs w:val="24"/>
+          <w:lang w:val="pt-BR" w:eastAsia="pt-BR"/>
+          <w14:ligatures w14:val="standardContextual"/>
         </w:rPr>
       </w:pPr>
-      <w:hyperlink w:anchor="_Toc242723846" w:history="1">
+      <w:hyperlink w:anchor="_Toc242867142" w:history="1">
         <w:r>
           <w:rPr>
             <w:rStyle w:val="Hyperlink"/>
@@ -363,7 +383,7 @@
             <w:noProof/>
             <w:webHidden/>
           </w:rPr>
-          <w:instrText xml:space="preserve"> PAGEREF _Toc242723846 \h </w:instrText>
+          <w:instrText xml:space="preserve"> PAGEREF _Toc242867142 \h </w:instrText>
         </w:r>
         <w:r>
           <w:rPr>
@@ -401,10 +421,17 @@
           <w:tab w:val="right" w:leader="dot" w:pos="9396"/>
         </w:tabs>
         <w:rPr>
+          <w:rFonts w:asciiTheme="minorHAnsi" w:hAnsiTheme="minorHAnsi"/>
           <w:noProof/>
+          <w:color w:val="auto"/>
+          <w:kern w:val="2"/>
+          <w:sz w:val="24"/>
+          <w:szCs w:val="24"/>
+          <w:lang w:val="pt-BR" w:eastAsia="pt-BR"/>
+          <w14:ligatures w14:val="standardContextual"/>
         </w:rPr>
       </w:pPr>
-      <w:hyperlink w:anchor="_Toc242723847" w:history="1">
+      <w:hyperlink w:anchor="_Toc242867143" w:history="1">
         <w:r>
           <w:rPr>
             <w:rStyle w:val="Hyperlink"/>
@@ -431,7 +458,7 @@
             <w:noProof/>
             <w:webHidden/>
           </w:rPr>
-          <w:instrText xml:space="preserve"> PAGEREF _Toc242723847 \h </w:instrText>
+          <w:instrText xml:space="preserve"> PAGEREF _Toc242867143 \h </w:instrText>
         </w:r>
         <w:r>
           <w:rPr>
@@ -469,10 +496,17 @@
           <w:tab w:val="right" w:leader="dot" w:pos="9396"/>
         </w:tabs>
         <w:rPr>
+          <w:rFonts w:asciiTheme="minorHAnsi" w:hAnsiTheme="minorHAnsi"/>
           <w:noProof/>
+          <w:color w:val="auto"/>
+          <w:kern w:val="2"/>
+          <w:sz w:val="24"/>
+          <w:szCs w:val="24"/>
+          <w:lang w:val="pt-BR" w:eastAsia="pt-BR"/>
+          <w14:ligatures w14:val="standardContextual"/>
         </w:rPr>
       </w:pPr>
-      <w:hyperlink w:anchor="_Toc242723848" w:history="1">
+      <w:hyperlink w:anchor="_Toc242867144" w:history="1">
         <w:r>
           <w:rPr>
             <w:rStyle w:val="Hyperlink"/>
@@ -499,7 +533,7 @@
             <w:noProof/>
             <w:webHidden/>
           </w:rPr>
-          <w:instrText xml:space="preserve"> PAGEREF _Toc242723848 \h </w:instrText>
+          <w:instrText xml:space="preserve"> PAGEREF _Toc242867144 \h </w:instrText>
         </w:r>
         <w:r>
           <w:rPr>
@@ -537,10 +571,17 @@
           <w:tab w:val="right" w:leader="dot" w:pos="9396"/>
         </w:tabs>
         <w:rPr>
+          <w:rFonts w:asciiTheme="minorHAnsi" w:hAnsiTheme="minorHAnsi"/>
           <w:noProof/>
+          <w:color w:val="auto"/>
+          <w:kern w:val="2"/>
+          <w:sz w:val="24"/>
+          <w:szCs w:val="24"/>
+          <w:lang w:val="pt-BR" w:eastAsia="pt-BR"/>
+          <w14:ligatures w14:val="standardContextual"/>
         </w:rPr>
       </w:pPr>
-      <w:hyperlink w:anchor="_Toc242723849" w:history="1">
+      <w:hyperlink w:anchor="_Toc242867145" w:history="1">
         <w:r>
           <w:rPr>
             <w:rStyle w:val="Hyperlink"/>
@@ -567,7 +608,7 @@
             <w:noProof/>
             <w:webHidden/>
           </w:rPr>
-          <w:instrText xml:space="preserve"> PAGEREF _Toc242723849 \h </w:instrText>
+          <w:instrText xml:space="preserve"> PAGEREF _Toc242867145 \h </w:instrText>
         </w:r>
         <w:r>
           <w:rPr>
@@ -605,10 +646,17 @@
           <w:tab w:val="right" w:leader="dot" w:pos="9396"/>
         </w:tabs>
         <w:rPr>
+          <w:rFonts w:asciiTheme="minorHAnsi" w:hAnsiTheme="minorHAnsi"/>
           <w:noProof/>
+          <w:color w:val="auto"/>
+          <w:kern w:val="2"/>
+          <w:sz w:val="24"/>
+          <w:szCs w:val="24"/>
+          <w:lang w:val="pt-BR" w:eastAsia="pt-BR"/>
+          <w14:ligatures w14:val="standardContextual"/>
         </w:rPr>
       </w:pPr>
-      <w:hyperlink w:anchor="_Toc242723850" w:history="1">
+      <w:hyperlink w:anchor="_Toc242867146" w:history="1">
         <w:r>
           <w:rPr>
             <w:rStyle w:val="Hyperlink"/>
@@ -635,7 +683,7 @@
             <w:noProof/>
             <w:webHidden/>
           </w:rPr>
-          <w:instrText xml:space="preserve"> PAGEREF _Toc242723850 \h </w:instrText>
+          <w:instrText xml:space="preserve"> PAGEREF _Toc242867146 \h </w:instrText>
         </w:r>
         <w:r>
           <w:rPr>
@@ -673,10 +721,17 @@
           <w:tab w:val="right" w:leader="dot" w:pos="9396"/>
         </w:tabs>
         <w:rPr>
+          <w:rFonts w:asciiTheme="minorHAnsi" w:hAnsiTheme="minorHAnsi"/>
           <w:noProof/>
+          <w:color w:val="auto"/>
+          <w:kern w:val="2"/>
+          <w:sz w:val="24"/>
+          <w:szCs w:val="24"/>
+          <w:lang w:val="pt-BR" w:eastAsia="pt-BR"/>
+          <w14:ligatures w14:val="standardContextual"/>
         </w:rPr>
       </w:pPr>
-      <w:hyperlink w:anchor="_Toc242723851" w:history="1">
+      <w:hyperlink w:anchor="_Toc242867147" w:history="1">
         <w:r>
           <w:rPr>
             <w:rStyle w:val="Hyperlink"/>
@@ -703,7 +758,7 @@
             <w:noProof/>
             <w:webHidden/>
           </w:rPr>
-          <w:instrText xml:space="preserve"> PAGEREF _Toc242723851 \h </w:instrText>
+          <w:instrText xml:space="preserve"> PAGEREF _Toc242867147 \h </w:instrText>
         </w:r>
         <w:r>
           <w:rPr>
@@ -741,10 +796,17 @@
           <w:tab w:val="right" w:leader="dot" w:pos="9396"/>
         </w:tabs>
         <w:rPr>
+          <w:rFonts w:asciiTheme="minorHAnsi" w:hAnsiTheme="minorHAnsi"/>
           <w:noProof/>
+          <w:color w:val="auto"/>
+          <w:kern w:val="2"/>
+          <w:sz w:val="24"/>
+          <w:szCs w:val="24"/>
+          <w:lang w:val="pt-BR" w:eastAsia="pt-BR"/>
+          <w14:ligatures w14:val="standardContextual"/>
         </w:rPr>
       </w:pPr>
-      <w:hyperlink w:anchor="_Toc242723852" w:history="1">
+      <w:hyperlink w:anchor="_Toc242867148" w:history="1">
         <w:r>
           <w:rPr>
             <w:rStyle w:val="Hyperlink"/>
@@ -771,7 +833,7 @@
             <w:noProof/>
             <w:webHidden/>
           </w:rPr>
-          <w:instrText xml:space="preserve"> PAGEREF _Toc242723852 \h </w:instrText>
+          <w:instrText xml:space="preserve"> PAGEREF _Toc242867148 \h </w:instrText>
         </w:r>
         <w:r>
           <w:rPr>
@@ -809,10 +871,17 @@
           <w:tab w:val="right" w:leader="dot" w:pos="9396"/>
         </w:tabs>
         <w:rPr>
+          <w:rFonts w:asciiTheme="minorHAnsi" w:hAnsiTheme="minorHAnsi"/>
           <w:noProof/>
+          <w:color w:val="auto"/>
+          <w:kern w:val="2"/>
+          <w:sz w:val="24"/>
+          <w:szCs w:val="24"/>
+          <w:lang w:val="pt-BR" w:eastAsia="pt-BR"/>
+          <w14:ligatures w14:val="standardContextual"/>
         </w:rPr>
       </w:pPr>
-      <w:hyperlink w:anchor="_Toc242723853" w:history="1">
+      <w:hyperlink w:anchor="_Toc242867149" w:history="1">
         <w:r>
           <w:rPr>
             <w:rStyle w:val="Hyperlink"/>
@@ -839,7 +908,7 @@
             <w:noProof/>
             <w:webHidden/>
           </w:rPr>
-          <w:instrText xml:space="preserve"> PAGEREF _Toc242723853 \h </w:instrText>
+          <w:instrText xml:space="preserve"> PAGEREF _Toc242867149 \h </w:instrText>
         </w:r>
         <w:r>
           <w:rPr>
@@ -877,10 +946,17 @@
           <w:tab w:val="right" w:leader="dot" w:pos="9396"/>
         </w:tabs>
         <w:rPr>
+          <w:rFonts w:asciiTheme="minorHAnsi" w:hAnsiTheme="minorHAnsi"/>
           <w:noProof/>
+          <w:color w:val="auto"/>
+          <w:kern w:val="2"/>
+          <w:sz w:val="24"/>
+          <w:szCs w:val="24"/>
+          <w:lang w:val="pt-BR" w:eastAsia="pt-BR"/>
+          <w14:ligatures w14:val="standardContextual"/>
         </w:rPr>
       </w:pPr>
-      <w:hyperlink w:anchor="_Toc242723854" w:history="1">
+      <w:hyperlink w:anchor="_Toc242867150" w:history="1">
         <w:r>
           <w:rPr>
             <w:rStyle w:val="Hyperlink"/>
@@ -907,7 +983,7 @@
             <w:noProof/>
             <w:webHidden/>
           </w:rPr>
-          <w:instrText xml:space="preserve"> PAGEREF _Toc242723854 \h </w:instrText>
+          <w:instrText xml:space="preserve"> PAGEREF _Toc242867150 \h </w:instrText>
         </w:r>
         <w:r>
           <w:rPr>
@@ -945,10 +1021,17 @@
           <w:tab w:val="right" w:leader="dot" w:pos="9396"/>
         </w:tabs>
         <w:rPr>
+          <w:rFonts w:asciiTheme="minorHAnsi" w:hAnsiTheme="minorHAnsi"/>
           <w:noProof/>
+          <w:color w:val="auto"/>
+          <w:kern w:val="2"/>
+          <w:sz w:val="24"/>
+          <w:szCs w:val="24"/>
+          <w:lang w:val="pt-BR" w:eastAsia="pt-BR"/>
+          <w14:ligatures w14:val="standardContextual"/>
         </w:rPr>
       </w:pPr>
-      <w:hyperlink w:anchor="_Toc242723855" w:history="1">
+      <w:hyperlink w:anchor="_Toc242867151" w:history="1">
         <w:r>
           <w:rPr>
             <w:rStyle w:val="Hyperlink"/>
@@ -975,7 +1058,7 @@
             <w:noProof/>
             <w:webHidden/>
           </w:rPr>
-          <w:instrText xml:space="preserve"> PAGEREF _Toc242723855 \h </w:instrText>
+          <w:instrText xml:space="preserve"> PAGEREF _Toc242867151 \h </w:instrText>
         </w:r>
         <w:r>
           <w:rPr>
@@ -1013,10 +1096,17 @@
           <w:tab w:val="right" w:leader="dot" w:pos="9396"/>
         </w:tabs>
         <w:rPr>
+          <w:rFonts w:asciiTheme="minorHAnsi" w:hAnsiTheme="minorHAnsi"/>
           <w:noProof/>
+          <w:color w:val="auto"/>
+          <w:kern w:val="2"/>
+          <w:sz w:val="24"/>
+          <w:szCs w:val="24"/>
+          <w:lang w:val="pt-BR" w:eastAsia="pt-BR"/>
+          <w14:ligatures w14:val="standardContextual"/>
         </w:rPr>
       </w:pPr>
-      <w:hyperlink w:anchor="_Toc242723856" w:history="1">
+      <w:hyperlink w:anchor="_Toc242867152" w:history="1">
         <w:r>
           <w:rPr>
             <w:rStyle w:val="Hyperlink"/>
@@ -1043,7 +1133,7 @@
             <w:noProof/>
             <w:webHidden/>
           </w:rPr>
-          <w:instrText xml:space="preserve"> PAGEREF _Toc242723856 \h </w:instrText>
+          <w:instrText xml:space="preserve"> PAGEREF _Toc242867152 \h </w:instrText>
         </w:r>
         <w:r>
           <w:rPr>
@@ -1081,10 +1171,17 @@
           <w:tab w:val="right" w:leader="dot" w:pos="9396"/>
         </w:tabs>
         <w:rPr>
+          <w:rFonts w:asciiTheme="minorHAnsi" w:hAnsiTheme="minorHAnsi"/>
           <w:noProof/>
+          <w:color w:val="auto"/>
+          <w:kern w:val="2"/>
+          <w:sz w:val="24"/>
+          <w:szCs w:val="24"/>
+          <w:lang w:val="pt-BR" w:eastAsia="pt-BR"/>
+          <w14:ligatures w14:val="standardContextual"/>
         </w:rPr>
       </w:pPr>
-      <w:hyperlink w:anchor="_Toc242723857" w:history="1">
+      <w:hyperlink w:anchor="_Toc242867153" w:history="1">
         <w:r>
           <w:rPr>
             <w:rStyle w:val="Hyperlink"/>
@@ -1111,7 +1208,7 @@
             <w:noProof/>
             <w:webHidden/>
           </w:rPr>
-          <w:instrText xml:space="preserve"> PAGEREF _Toc242723857 \h </w:instrText>
+          <w:instrText xml:space="preserve"> PAGEREF _Toc242867153 \h </w:instrText>
         </w:r>
         <w:r>
           <w:rPr>
@@ -1131,7 +1228,7 @@
             <w:noProof/>
             <w:webHidden/>
           </w:rPr>
-          <w:t>9</w:t>
+          <w:t>10</w:t>
         </w:r>
         <w:r>
           <w:rPr>
@@ -1149,10 +1246,17 @@
           <w:tab w:val="right" w:leader="dot" w:pos="9396"/>
         </w:tabs>
         <w:rPr>
+          <w:rFonts w:asciiTheme="minorHAnsi" w:hAnsiTheme="minorHAnsi"/>
           <w:noProof/>
+          <w:color w:val="auto"/>
+          <w:kern w:val="2"/>
+          <w:sz w:val="24"/>
+          <w:szCs w:val="24"/>
+          <w:lang w:val="pt-BR" w:eastAsia="pt-BR"/>
+          <w14:ligatures w14:val="standardContextual"/>
         </w:rPr>
       </w:pPr>
-      <w:hyperlink w:anchor="_Toc242723858" w:history="1">
+      <w:hyperlink w:anchor="_Toc242867154" w:history="1">
         <w:r>
           <w:rPr>
             <w:rStyle w:val="Hyperlink"/>
@@ -1179,7 +1283,7 @@
             <w:noProof/>
             <w:webHidden/>
           </w:rPr>
-          <w:instrText xml:space="preserve"> PAGEREF _Toc242723858 \h </w:instrText>
+          <w:instrText xml:space="preserve"> PAGEREF _Toc242867154 \h </w:instrText>
         </w:r>
         <w:r>
           <w:rPr>
@@ -1217,10 +1321,17 @@
           <w:tab w:val="right" w:leader="dot" w:pos="9396"/>
         </w:tabs>
         <w:rPr>
+          <w:rFonts w:asciiTheme="minorHAnsi" w:hAnsiTheme="minorHAnsi"/>
           <w:noProof/>
+          <w:color w:val="auto"/>
+          <w:kern w:val="2"/>
+          <w:sz w:val="24"/>
+          <w:szCs w:val="24"/>
+          <w:lang w:val="pt-BR" w:eastAsia="pt-BR"/>
+          <w14:ligatures w14:val="standardContextual"/>
         </w:rPr>
       </w:pPr>
-      <w:hyperlink w:anchor="_Toc242723859" w:history="1">
+      <w:hyperlink w:anchor="_Toc242867155" w:history="1">
         <w:r>
           <w:rPr>
             <w:rStyle w:val="Hyperlink"/>
@@ -1247,7 +1358,7 @@
             <w:noProof/>
             <w:webHidden/>
           </w:rPr>
-          <w:instrText xml:space="preserve"> PAGEREF _Toc242723859 \h </w:instrText>
+          <w:instrText xml:space="preserve"> PAGEREF _Toc242867155 \h </w:instrText>
         </w:r>
         <w:r>
           <w:rPr>
@@ -1285,10 +1396,17 @@
           <w:tab w:val="right" w:leader="dot" w:pos="9396"/>
         </w:tabs>
         <w:rPr>
+          <w:rFonts w:asciiTheme="minorHAnsi" w:hAnsiTheme="minorHAnsi"/>
           <w:noProof/>
+          <w:color w:val="auto"/>
+          <w:kern w:val="2"/>
+          <w:sz w:val="24"/>
+          <w:szCs w:val="24"/>
+          <w:lang w:val="pt-BR" w:eastAsia="pt-BR"/>
+          <w14:ligatures w14:val="standardContextual"/>
         </w:rPr>
       </w:pPr>
-      <w:hyperlink w:anchor="_Toc242723860" w:history="1">
+      <w:hyperlink w:anchor="_Toc242867156" w:history="1">
         <w:r>
           <w:rPr>
             <w:rStyle w:val="Hyperlink"/>
@@ -1315,7 +1433,7 @@
             <w:noProof/>
             <w:webHidden/>
           </w:rPr>
-          <w:instrText xml:space="preserve"> PAGEREF _Toc242723860 \h </w:instrText>
+          <w:instrText xml:space="preserve"> PAGEREF _Toc242867156 \h </w:instrText>
         </w:r>
         <w:r>
           <w:rPr>
@@ -1353,10 +1471,17 @@
           <w:tab w:val="right" w:leader="dot" w:pos="9396"/>
         </w:tabs>
         <w:rPr>
+          <w:rFonts w:asciiTheme="minorHAnsi" w:hAnsiTheme="minorHAnsi"/>
           <w:noProof/>
+          <w:color w:val="auto"/>
+          <w:kern w:val="2"/>
+          <w:sz w:val="24"/>
+          <w:szCs w:val="24"/>
+          <w:lang w:val="pt-BR" w:eastAsia="pt-BR"/>
+          <w14:ligatures w14:val="standardContextual"/>
         </w:rPr>
       </w:pPr>
-      <w:hyperlink w:anchor="_Toc242723861" w:history="1">
+      <w:hyperlink w:anchor="_Toc242867157" w:history="1">
         <w:r>
           <w:rPr>
             <w:rStyle w:val="Hyperlink"/>
@@ -1383,7 +1508,7 @@
             <w:noProof/>
             <w:webHidden/>
           </w:rPr>
-          <w:instrText xml:space="preserve"> PAGEREF _Toc242723861 \h </w:instrText>
+          <w:instrText xml:space="preserve"> PAGEREF _Toc242867157 \h </w:instrText>
         </w:r>
         <w:r>
           <w:rPr>
@@ -1421,10 +1546,17 @@
           <w:tab w:val="right" w:leader="dot" w:pos="9396"/>
         </w:tabs>
         <w:rPr>
+          <w:rFonts w:asciiTheme="minorHAnsi" w:hAnsiTheme="minorHAnsi"/>
           <w:noProof/>
+          <w:color w:val="auto"/>
+          <w:kern w:val="2"/>
+          <w:sz w:val="24"/>
+          <w:szCs w:val="24"/>
+          <w:lang w:val="pt-BR" w:eastAsia="pt-BR"/>
+          <w14:ligatures w14:val="standardContextual"/>
         </w:rPr>
       </w:pPr>
-      <w:hyperlink w:anchor="_Toc242723862" w:history="1">
+      <w:hyperlink w:anchor="_Toc242867158" w:history="1">
         <w:r>
           <w:rPr>
             <w:rStyle w:val="Hyperlink"/>
@@ -1451,7 +1583,7 @@
             <w:noProof/>
             <w:webHidden/>
           </w:rPr>
-          <w:instrText xml:space="preserve"> PAGEREF _Toc242723862 \h </w:instrText>
+          <w:instrText xml:space="preserve"> PAGEREF _Toc242867158 \h </w:instrText>
         </w:r>
         <w:r>
           <w:rPr>
@@ -1489,10 +1621,17 @@
           <w:tab w:val="right" w:leader="dot" w:pos="9396"/>
         </w:tabs>
         <w:rPr>
+          <w:rFonts w:asciiTheme="minorHAnsi" w:hAnsiTheme="minorHAnsi"/>
           <w:noProof/>
+          <w:color w:val="auto"/>
+          <w:kern w:val="2"/>
+          <w:sz w:val="24"/>
+          <w:szCs w:val="24"/>
+          <w:lang w:val="pt-BR" w:eastAsia="pt-BR"/>
+          <w14:ligatures w14:val="standardContextual"/>
         </w:rPr>
       </w:pPr>
-      <w:hyperlink w:anchor="_Toc242723863" w:history="1">
+      <w:hyperlink w:anchor="_Toc242867159" w:history="1">
         <w:r>
           <w:rPr>
             <w:rStyle w:val="Hyperlink"/>
@@ -1519,7 +1658,7 @@
             <w:noProof/>
             <w:webHidden/>
           </w:rPr>
-          <w:instrText xml:space="preserve"> PAGEREF _Toc242723863 \h </w:instrText>
+          <w:instrText xml:space="preserve"> PAGEREF _Toc242867159 \h </w:instrText>
         </w:r>
         <w:r>
           <w:rPr>
@@ -1557,10 +1696,17 @@
           <w:tab w:val="right" w:leader="dot" w:pos="9396"/>
         </w:tabs>
         <w:rPr>
+          <w:rFonts w:asciiTheme="minorHAnsi" w:hAnsiTheme="minorHAnsi"/>
           <w:noProof/>
+          <w:color w:val="auto"/>
+          <w:kern w:val="2"/>
+          <w:sz w:val="24"/>
+          <w:szCs w:val="24"/>
+          <w:lang w:val="pt-BR" w:eastAsia="pt-BR"/>
+          <w14:ligatures w14:val="standardContextual"/>
         </w:rPr>
       </w:pPr>
-      <w:hyperlink w:anchor="_Toc242723864" w:history="1">
+      <w:hyperlink w:anchor="_Toc242867160" w:history="1">
         <w:r>
           <w:rPr>
             <w:rStyle w:val="Hyperlink"/>
@@ -1587,7 +1733,7 @@
             <w:noProof/>
             <w:webHidden/>
           </w:rPr>
-          <w:instrText xml:space="preserve"> PAGEREF _Toc242723864 \h </w:instrText>
+          <w:instrText xml:space="preserve"> PAGEREF _Toc242867160 \h </w:instrText>
         </w:r>
         <w:r>
           <w:rPr>
@@ -1625,10 +1771,17 @@
           <w:tab w:val="right" w:leader="dot" w:pos="9396"/>
         </w:tabs>
         <w:rPr>
+          <w:rFonts w:asciiTheme="minorHAnsi" w:hAnsiTheme="minorHAnsi"/>
           <w:noProof/>
+          <w:color w:val="auto"/>
+          <w:kern w:val="2"/>
+          <w:sz w:val="24"/>
+          <w:szCs w:val="24"/>
+          <w:lang w:val="pt-BR" w:eastAsia="pt-BR"/>
+          <w14:ligatures w14:val="standardContextual"/>
         </w:rPr>
       </w:pPr>
-      <w:hyperlink w:anchor="_Toc242723865" w:history="1">
+      <w:hyperlink w:anchor="_Toc242867161" w:history="1">
         <w:r>
           <w:rPr>
             <w:rStyle w:val="Hyperlink"/>
@@ -1655,7 +1808,7 @@
             <w:noProof/>
             <w:webHidden/>
           </w:rPr>
-          <w:instrText xml:space="preserve"> PAGEREF _Toc242723865 \h </w:instrText>
+          <w:instrText xml:space="preserve"> PAGEREF _Toc242867161 \h </w:instrText>
         </w:r>
         <w:r>
           <w:rPr>
@@ -1693,10 +1846,17 @@
           <w:tab w:val="right" w:leader="dot" w:pos="9396"/>
         </w:tabs>
         <w:rPr>
+          <w:rFonts w:asciiTheme="minorHAnsi" w:hAnsiTheme="minorHAnsi"/>
           <w:noProof/>
+          <w:color w:val="auto"/>
+          <w:kern w:val="2"/>
+          <w:sz w:val="24"/>
+          <w:szCs w:val="24"/>
+          <w:lang w:val="pt-BR" w:eastAsia="pt-BR"/>
+          <w14:ligatures w14:val="standardContextual"/>
         </w:rPr>
       </w:pPr>
-      <w:hyperlink w:anchor="_Toc242723866" w:history="1">
+      <w:hyperlink w:anchor="_Toc242867162" w:history="1">
         <w:r>
           <w:rPr>
             <w:rStyle w:val="Hyperlink"/>
@@ -1723,7 +1883,7 @@
             <w:noProof/>
             <w:webHidden/>
           </w:rPr>
-          <w:instrText xml:space="preserve"> PAGEREF _Toc242723866 \h </w:instrText>
+          <w:instrText xml:space="preserve"> PAGEREF _Toc242867162 \h </w:instrText>
         </w:r>
         <w:r>
           <w:rPr>
@@ -1743,7 +1903,7 @@
             <w:noProof/>
             <w:webHidden/>
           </w:rPr>
-          <w:t>11</w:t>
+          <w:t>12</w:t>
         </w:r>
         <w:r>
           <w:rPr>
@@ -1761,10 +1921,17 @@
           <w:tab w:val="right" w:leader="dot" w:pos="9396"/>
         </w:tabs>
         <w:rPr>
+          <w:rFonts w:asciiTheme="minorHAnsi" w:hAnsiTheme="minorHAnsi"/>
           <w:noProof/>
+          <w:color w:val="auto"/>
+          <w:kern w:val="2"/>
+          <w:sz w:val="24"/>
+          <w:szCs w:val="24"/>
+          <w:lang w:val="pt-BR" w:eastAsia="pt-BR"/>
+          <w14:ligatures w14:val="standardContextual"/>
         </w:rPr>
       </w:pPr>
-      <w:hyperlink w:anchor="_Toc242723867" w:history="1">
+      <w:hyperlink w:anchor="_Toc242867163" w:history="1">
         <w:r>
           <w:rPr>
             <w:rStyle w:val="Hyperlink"/>
@@ -1791,7 +1958,7 @@
             <w:noProof/>
             <w:webHidden/>
           </w:rPr>
-          <w:instrText xml:space="preserve"> PAGEREF _Toc242723867 \h </w:instrText>
+          <w:instrText xml:space="preserve"> PAGEREF _Toc242867163 \h </w:instrText>
         </w:r>
         <w:r>
           <w:rPr>
@@ -1829,10 +1996,17 @@
           <w:tab w:val="right" w:leader="dot" w:pos="9396"/>
         </w:tabs>
         <w:rPr>
+          <w:rFonts w:asciiTheme="minorHAnsi" w:hAnsiTheme="minorHAnsi"/>
           <w:noProof/>
+          <w:color w:val="auto"/>
+          <w:kern w:val="2"/>
+          <w:sz w:val="24"/>
+          <w:szCs w:val="24"/>
+          <w:lang w:val="pt-BR" w:eastAsia="pt-BR"/>
+          <w14:ligatures w14:val="standardContextual"/>
         </w:rPr>
       </w:pPr>
-      <w:hyperlink w:anchor="_Toc242723868" w:history="1">
+      <w:hyperlink w:anchor="_Toc242867164" w:history="1">
         <w:r>
           <w:rPr>
             <w:rStyle w:val="Hyperlink"/>
@@ -1859,7 +2033,7 @@
             <w:noProof/>
             <w:webHidden/>
           </w:rPr>
-          <w:instrText xml:space="preserve"> PAGEREF _Toc242723868 \h </w:instrText>
+          <w:instrText xml:space="preserve"> PAGEREF _Toc242867164 \h </w:instrText>
         </w:r>
         <w:r>
           <w:rPr>
@@ -1897,10 +2071,17 @@
           <w:tab w:val="right" w:leader="dot" w:pos="9396"/>
         </w:tabs>
         <w:rPr>
+          <w:rFonts w:asciiTheme="minorHAnsi" w:hAnsiTheme="minorHAnsi"/>
           <w:noProof/>
+          <w:color w:val="auto"/>
+          <w:kern w:val="2"/>
+          <w:sz w:val="24"/>
+          <w:szCs w:val="24"/>
+          <w:lang w:val="pt-BR" w:eastAsia="pt-BR"/>
+          <w14:ligatures w14:val="standardContextual"/>
         </w:rPr>
       </w:pPr>
-      <w:hyperlink w:anchor="_Toc242723869" w:history="1">
+      <w:hyperlink w:anchor="_Toc242867165" w:history="1">
         <w:r>
           <w:rPr>
             <w:rStyle w:val="Hyperlink"/>
@@ -1927,7 +2108,7 @@
             <w:noProof/>
             <w:webHidden/>
           </w:rPr>
-          <w:instrText xml:space="preserve"> PAGEREF _Toc242723869 \h </w:instrText>
+          <w:instrText xml:space="preserve"> PAGEREF _Toc242867165 \h </w:instrText>
         </w:r>
         <w:r>
           <w:rPr>
@@ -1948,6 +2129,81 @@
             <w:webHidden/>
           </w:rPr>
           <w:t>12</w:t>
+        </w:r>
+        <w:r>
+          <w:rPr>
+            <w:noProof/>
+            <w:webHidden/>
+          </w:rPr>
+          <w:fldChar w:fldCharType="end"/>
+        </w:r>
+      </w:hyperlink>
+    </w:p>
+    <w:p>
+      <w:pPr>
+        <w:pStyle w:val="Sumrio2"/>
+        <w:tabs>
+          <w:tab w:val="right" w:leader="dot" w:pos="9396"/>
+        </w:tabs>
+        <w:rPr>
+          <w:rFonts w:asciiTheme="minorHAnsi" w:hAnsiTheme="minorHAnsi"/>
+          <w:noProof/>
+          <w:color w:val="auto"/>
+          <w:kern w:val="2"/>
+          <w:sz w:val="24"/>
+          <w:szCs w:val="24"/>
+          <w:lang w:val="pt-BR" w:eastAsia="pt-BR"/>
+          <w14:ligatures w14:val="standardContextual"/>
+        </w:rPr>
+      </w:pPr>
+      <w:hyperlink w:anchor="_Toc242867166" w:history="1">
+        <w:r>
+          <w:rPr>
+            <w:rStyle w:val="Hyperlink"/>
+            <w:noProof/>
+          </w:rPr>
+          <w:t>3.22. Risco da Carteira</w:t>
+        </w:r>
+        <w:r>
+          <w:rPr>
+            <w:noProof/>
+            <w:webHidden/>
+          </w:rPr>
+          <w:tab/>
+        </w:r>
+        <w:r>
+          <w:rPr>
+            <w:noProof/>
+            <w:webHidden/>
+          </w:rPr>
+          <w:fldChar w:fldCharType="begin"/>
+        </w:r>
+        <w:r>
+          <w:rPr>
+            <w:noProof/>
+            <w:webHidden/>
+          </w:rPr>
+          <w:instrText xml:space="preserve"> PAGEREF _Toc242867166 \h </w:instrText>
+        </w:r>
+        <w:r>
+          <w:rPr>
+            <w:noProof/>
+            <w:webHidden/>
+          </w:rPr>
+        </w:r>
+        <w:r>
+          <w:rPr>
+            <w:noProof/>
+            <w:webHidden/>
+          </w:rPr>
+          <w:fldChar w:fldCharType="separate"/>
+        </w:r>
+        <w:r>
+          <w:rPr>
+            <w:noProof/>
+            <w:webHidden/>
+          </w:rPr>
+          <w:t>13</w:t>
         </w:r>
         <w:r>
           <w:rPr>
@@ -1965,10 +2221,17 @@
           <w:tab w:val="right" w:leader="dot" w:pos="9396"/>
         </w:tabs>
         <w:rPr>
+          <w:rFonts w:asciiTheme="minorHAnsi" w:hAnsiTheme="minorHAnsi"/>
           <w:noProof/>
+          <w:color w:val="auto"/>
+          <w:kern w:val="2"/>
+          <w:sz w:val="24"/>
+          <w:szCs w:val="24"/>
+          <w:lang w:val="pt-BR" w:eastAsia="pt-BR"/>
+          <w14:ligatures w14:val="standardContextual"/>
         </w:rPr>
       </w:pPr>
-      <w:hyperlink w:anchor="_Toc242723870" w:history="1">
+      <w:hyperlink w:anchor="_Toc242867167" w:history="1">
         <w:r>
           <w:rPr>
             <w:rStyle w:val="Hyperlink"/>
@@ -1995,7 +2258,7 @@
             <w:noProof/>
             <w:webHidden/>
           </w:rPr>
-          <w:instrText xml:space="preserve"> PAGEREF _Toc242723870 \h </w:instrText>
+          <w:instrText xml:space="preserve"> PAGEREF _Toc242867167 \h </w:instrText>
         </w:r>
         <w:r>
           <w:rPr>
@@ -2015,7 +2278,7 @@
             <w:noProof/>
             <w:webHidden/>
           </w:rPr>
-          <w:t>13</w:t>
+          <w:t>14</w:t>
         </w:r>
         <w:r>
           <w:rPr>
@@ -2033,10 +2296,17 @@
           <w:tab w:val="right" w:leader="dot" w:pos="9396"/>
         </w:tabs>
         <w:rPr>
+          <w:rFonts w:asciiTheme="minorHAnsi" w:hAnsiTheme="minorHAnsi"/>
           <w:noProof/>
+          <w:color w:val="auto"/>
+          <w:kern w:val="2"/>
+          <w:sz w:val="24"/>
+          <w:szCs w:val="24"/>
+          <w:lang w:val="pt-BR" w:eastAsia="pt-BR"/>
+          <w14:ligatures w14:val="standardContextual"/>
         </w:rPr>
       </w:pPr>
-      <w:hyperlink w:anchor="_Toc242723871" w:history="1">
+      <w:hyperlink w:anchor="_Toc242867168" w:history="1">
         <w:r>
           <w:rPr>
             <w:rStyle w:val="Hyperlink"/>
@@ -2063,7 +2333,7 @@
             <w:noProof/>
             <w:webHidden/>
           </w:rPr>
-          <w:instrText xml:space="preserve"> PAGEREF _Toc242723871 \h </w:instrText>
+          <w:instrText xml:space="preserve"> PAGEREF _Toc242867168 \h </w:instrText>
         </w:r>
         <w:r>
           <w:rPr>
@@ -2083,7 +2353,7 @@
             <w:noProof/>
             <w:webHidden/>
           </w:rPr>
-          <w:t>14</w:t>
+          <w:t>15</w:t>
         </w:r>
         <w:r>
           <w:rPr>
@@ -2101,10 +2371,17 @@
           <w:tab w:val="right" w:leader="dot" w:pos="9396"/>
         </w:tabs>
         <w:rPr>
+          <w:rFonts w:asciiTheme="minorHAnsi" w:hAnsiTheme="minorHAnsi"/>
           <w:noProof/>
+          <w:color w:val="auto"/>
+          <w:kern w:val="2"/>
+          <w:sz w:val="24"/>
+          <w:szCs w:val="24"/>
+          <w:lang w:val="pt-BR" w:eastAsia="pt-BR"/>
+          <w14:ligatures w14:val="standardContextual"/>
         </w:rPr>
       </w:pPr>
-      <w:hyperlink w:anchor="_Toc242723872" w:history="1">
+      <w:hyperlink w:anchor="_Toc242867169" w:history="1">
         <w:r>
           <w:rPr>
             <w:rStyle w:val="Hyperlink"/>
@@ -2131,7 +2408,7 @@
             <w:noProof/>
             <w:webHidden/>
           </w:rPr>
-          <w:instrText xml:space="preserve"> PAGEREF _Toc242723872 \h </w:instrText>
+          <w:instrText xml:space="preserve"> PAGEREF _Toc242867169 \h </w:instrText>
         </w:r>
         <w:r>
           <w:rPr>
@@ -2151,7 +2428,7 @@
             <w:noProof/>
             <w:webHidden/>
           </w:rPr>
-          <w:t>15</w:t>
+          <w:t>16</w:t>
         </w:r>
         <w:r>
           <w:rPr>
@@ -2164,12 +2441,12 @@
     </w:p>
     <w:p>
       <w:r>
+        <w:lastRenderedPageBreak/>
         <w:fldChar w:fldCharType="end"/>
       </w:r>
     </w:p>
     <w:p>
       <w:r>
-        <w:lastRenderedPageBreak/>
         <w:br w:type="page"/>
       </w:r>
     </w:p>
@@ -2177,7 +2454,7 @@
       <w:pPr>
         <w:pStyle w:val="Ttulo1"/>
       </w:pPr>
-      <w:bookmarkStart w:id="1" w:name="_Toc242723844"/>
+      <w:bookmarkStart w:id="1" w:name="_Toc242867140"/>
       <w:r>
         <w:lastRenderedPageBreak/>
         <w:t>1. Visão Geral</w:t>
@@ -2186,10 +2463,7 @@
     </w:p>
     <w:p>
       <w:r>
-        <w:t>O BolsaTrader é um sistema web completo para acompanhamento pessoal de compra e venda de ações negociadas na B3. Ele vai além de uma simples planilha de controle: consolida as operações do investidor em posições de carteira, calcula lucro e perda em tempo real com base em cotações atualizadas, gera gráficos de acompanhamento, aplica indicadores técnicos consagrados (médias móveis, RSI e MACD) e conta com um robô consultor que analisa esses indicadores continuamente e sinaliza oportunidades de compra e venda</w:t>
-      </w:r>
-      <w:r>
-        <w:t xml:space="preserve"> - inclusive cadastrando reservas automaticamente para que o investidor só precise decidir, sem perder o sinal de vista.</w:t>
+        <w:t>O BolsaTrader é um sistema web completo para acompanhamento pessoal de compra e venda de ações negociadas na B3. Ele vai além de uma simples planilha de controle: consolida as operações do investidor em posições de carteira, calcula lucro e perda em tempo real com base em cotações atualizadas, gera gráficos de acompanhamento, aplica indicadores técnicos consagrados (médias móveis, RSI e MACD) e conta com um robô consultor que analisa esses indicadores continuamente e sinaliza oportunidades de compra e venda - inclusive cadastrando reservas automaticamente para que o investidor só precise decidir, sem perder o sinal de vista.</w:t>
       </w:r>
     </w:p>
     <w:p>
@@ -2201,7 +2475,7 @@
       <w:pPr>
         <w:pStyle w:val="Ttulo2"/>
       </w:pPr>
-      <w:bookmarkStart w:id="2" w:name="_Toc242723845"/>
+      <w:bookmarkStart w:id="2" w:name="_Toc242867141"/>
       <w:r>
         <w:t>1.1. Proposta de valor</w:t>
       </w:r>
@@ -2267,7 +2541,7 @@
       <w:pPr>
         <w:pStyle w:val="Ttulo2"/>
       </w:pPr>
-      <w:bookmarkStart w:id="3" w:name="_Toc242723846"/>
+      <w:bookmarkStart w:id="3" w:name="_Toc242867142"/>
       <w:r>
         <w:t>1.2. Diferenciais competitivos</w:t>
       </w:r>
@@ -2387,6 +2661,14 @@
       </w:r>
     </w:p>
     <w:p>
+      <w:pPr>
+        <w:pStyle w:val="Commarcadores"/>
+      </w:pPr>
+      <w:r>
+        <w:t>Risco da carteira inteira, não só de cada ação: gráfico de composição, correlação entre os ativos (mostra quando a "diversificação" é só aparente) e teste de estresse com o beta contra o Ibovespa — quanto a carteira cairia numa queda de 10%, 20% ou 30% do mercado e quais foram os piores dia, semana e mês do último ano.</w:t>
+      </w:r>
+    </w:p>
+    <w:p>
       <w:r>
         <w:br w:type="page"/>
       </w:r>
@@ -2395,7 +2677,7 @@
       <w:pPr>
         <w:pStyle w:val="Ttulo1"/>
       </w:pPr>
-      <w:bookmarkStart w:id="4" w:name="_Toc242723847"/>
+      <w:bookmarkStart w:id="4" w:name="_Toc242867143"/>
       <w:r>
         <w:lastRenderedPageBreak/>
         <w:t>2. Para Quem É Indicado</w:t>
@@ -2443,7 +2725,7 @@
       <w:pPr>
         <w:pStyle w:val="Ttulo1"/>
       </w:pPr>
-      <w:bookmarkStart w:id="5" w:name="_Toc242723848"/>
+      <w:bookmarkStart w:id="5" w:name="_Toc242867144"/>
       <w:r>
         <w:lastRenderedPageBreak/>
         <w:t>3. Funcionalidades Detalhadas</w:t>
@@ -2454,7 +2736,7 @@
       <w:pPr>
         <w:pStyle w:val="Ttulo2"/>
       </w:pPr>
-      <w:bookmarkStart w:id="6" w:name="_Toc242723849"/>
+      <w:bookmarkStart w:id="6" w:name="_Toc242867145"/>
       <w:r>
         <w:t>3.1. Painel de Controle</w:t>
       </w:r>
@@ -2462,17 +2744,14 @@
     </w:p>
     <w:p>
       <w:r>
-        <w:t>É a tela inicial do sistema: mostra em destaque a quantidade de ativos em carteira, o valor investido, o valor atual, o lucro/perda consolidado (em R$ e em %) e a pontuação do Ibovespa do dia. Logo abaixo, um painel em duas colunas reúne a comparação da carteira com o mercado e a tabela de posições compradas (já com os selos de reserva, meta atingida e sugestão do robô) de um lado, e um gráfico da variação da carteira ao longo do dia, os últimos registros de atualização e os alertas mais recentes do outro —</w:t>
-      </w:r>
-      <w:r>
-        <w:t xml:space="preserve"> com atualização automática da tela em segundo plano, sem precisar apertar F5. Atalhos rápidos, exportações e o mural "Atividade da comunidade" (quem mais comprou, vendeu ou reservou recentemente - sem revelar ativo, quantidade ou preço de ninguém) ficam nas telas Posições em Carteira e Histórico de Atualizações.</w:t>
+        <w:t>É a tela inicial do sistema: mostra em destaque a quantidade de ativos em carteira, o valor investido, o valor atual, o lucro/perda consolidado (em R$ e em %) e a pontuação do Ibovespa do dia. Logo abaixo, um painel em duas colunas reúne a comparação da carteira com o mercado e a tabela de posições compradas (já com os selos de reserva, meta atingida e sugestão do robô) de um lado, e um gráfico da variação da carteira ao longo do dia, os últimos registros de atualização e os alertas mais recentes do outro — com atualização automática da tela em segundo plano, sem precisar apertar F5. Atalhos rápidos, exportações e o mural "Atividade da comunidade" (quem mais comprou, vendeu ou reservou recentemente - sem revelar ativo, quantidade ou preço de ninguém) ficam nas telas Posições em Carteira e Histórico de Atualizações.</w:t>
       </w:r>
     </w:p>
     <w:p>
       <w:pPr>
         <w:pStyle w:val="Ttulo2"/>
       </w:pPr>
-      <w:bookmarkStart w:id="7" w:name="_Toc242723850"/>
+      <w:bookmarkStart w:id="7" w:name="_Toc242867146"/>
       <w:r>
         <w:t>3.2. Minhas Operações</w:t>
       </w:r>
@@ -2496,13 +2775,7 @@
         <w:pStyle w:val="Commarcadores"/>
       </w:pPr>
       <w:r>
-        <w:t>Reservadas: intenções de compra futura (inclusive as sugeridas automaticamente pelo robô consultor, claramente identificadas com o selo "</w:t>
-      </w:r>
-      <w:r>
-        <w:t>🤖</w:t>
-      </w:r>
-      <w:r>
-        <w:t xml:space="preserve"> Robô"). Filtro de data pela data da reserva.</w:t>
+        <w:t>Reservadas: intenções de compra futura (inclusive as sugeridas automaticamente pelo robô consultor, claramente identificadas com o selo "🤖 Robô"). Filtro de data pela data da reserva.</w:t>
       </w:r>
     </w:p>
     <w:p>
@@ -2533,7 +2806,7 @@
       <w:pPr>
         <w:pStyle w:val="Ttulo2"/>
       </w:pPr>
-      <w:bookmarkStart w:id="8" w:name="_Toc242723851"/>
+      <w:bookmarkStart w:id="8" w:name="_Toc242867147"/>
       <w:r>
         <w:t>3.3. Posições em Carteira</w:t>
       </w:r>
@@ -2541,13 +2814,7 @@
     </w:p>
     <w:p>
       <w:r>
-        <w:t>Consolida todas as compras e vendas por ativo em uma visão de carteira: quantidade líquida, preço médio, valor investido, cotação atual, valor atual, lucro/perda em R$ e em %, meta de lucro/perda e sinal de tendência. Ativos apenas reservados (sem compra efetiva) também aparecem, com o selo "</w:t>
-      </w:r>
-      <w:r>
-        <w:t>🔖</w:t>
-      </w:r>
-      <w:r>
-        <w:t xml:space="preserve"> Reservado", mostrando o preço pretendido e a variação desde a reserva.</w:t>
+        <w:t>Consolida todas as compras e vendas por ativo em uma visão de carteira: quantidade líquida, preço médio, valor investido, cotação atual, valor atual, lucro/perda em R$ e em %, meta de lucro/perda e sinal de tendência. Ativos apenas reservados (sem compra efetiva) também aparecem, com o selo "🔖 Reservado", mostrando o preço pretendido e a variação desde a reserva.</w:t>
       </w:r>
     </w:p>
     <w:p>
@@ -2580,13 +2847,7 @@
         <w:pStyle w:val="Commarcadores"/>
       </w:pPr>
       <w:r>
-        <w:t xml:space="preserve">Botão </w:t>
-      </w:r>
-      <w:r>
-        <w:t>📈</w:t>
-      </w:r>
-      <w:r>
-        <w:t xml:space="preserve"> em cada ativo comprado (também no Painel e em Minhas Operações): abre, sem sair da tela, o gráfico das cotações registradas com duas linhas de referência - o preço de compra e o alvo da meta de lucro.</w:t>
+        <w:t>Aba Indicadores de risco com gráfico de rosca do peso de cada ativo, volatilidade e drawdown por ativo, índice de concentração, matriz de correlação e teste de estresse (detalhes na seção 3.22).</w:t>
       </w:r>
     </w:p>
     <w:p>
@@ -2594,6 +2855,14 @@
         <w:pStyle w:val="Commarcadores"/>
       </w:pPr>
       <w:r>
+        <w:t>Botão 📈 em cada ativo comprado (também no Painel e em Minhas Operações): abre, sem sair da tela, o gráfico das cotações registradas com duas linhas de referência - o preço de compra e o alvo da meta de lucro.</w:t>
+      </w:r>
+    </w:p>
+    <w:p>
+      <w:pPr>
+        <w:pStyle w:val="Commarcadores"/>
+      </w:pPr>
+      <w:r>
         <w:t>Exportação em Excel e PDF com a tabela completa.</w:t>
       </w:r>
     </w:p>
@@ -2601,7 +2870,7 @@
       <w:pPr>
         <w:pStyle w:val="Ttulo2"/>
       </w:pPr>
-      <w:bookmarkStart w:id="9" w:name="_Toc242723852"/>
+      <w:bookmarkStart w:id="9" w:name="_Toc242867148"/>
       <w:r>
         <w:t>3.4. Análise de Mercado</w:t>
       </w:r>
@@ -2664,7 +2933,7 @@
       <w:pPr>
         <w:pStyle w:val="Ttulo2"/>
       </w:pPr>
-      <w:bookmarkStart w:id="10" w:name="_Toc242723853"/>
+      <w:bookmarkStart w:id="10" w:name="_Toc242867149"/>
       <w:r>
         <w:t>3.5. Robô Consultor</w:t>
       </w:r>
@@ -2696,13 +2965,7 @@
         <w:pStyle w:val="Commarcadores"/>
       </w:pPr>
       <w:r>
-        <w:t>Toda reserva ou posição de origem automática é claramente identificada em todas as telas com o selo "</w:t>
-      </w:r>
-      <w:r>
-        <w:t>🤖</w:t>
-      </w:r>
-      <w:r>
-        <w:t xml:space="preserve"> Robô" e uma linha destacada em cor própria, diferenciando-a de qualquer reserva cadastrada manualmente pelo usuário.</w:t>
+        <w:t>Toda reserva ou posição de origem automática é claramente identificada em todas as telas com o selo "🤖 Robô" e uma linha destacada em cor própria, diferenciando-a de qualquer reserva cadastrada manualmente pelo usuário.</w:t>
       </w:r>
     </w:p>
     <w:p>
@@ -2710,6 +2973,7 @@
         <w:pStyle w:val="Commarcadores"/>
       </w:pPr>
       <w:r>
+        <w:lastRenderedPageBreak/>
         <w:t>Os sinais do robô disparam alertas sonoros (um bipe discreto, sem precisar de nenhum arquivo de áudio) e aparecem destacados na tela de Avisos e Lembretes, com a mesma cor de "compra" ou "venda" usada no resto do sistema.</w:t>
       </w:r>
     </w:p>
@@ -2718,358 +2982,342 @@
         <w:pStyle w:val="Commarcadores"/>
       </w:pPr>
       <w:r>
+        <w:t>Backtesting do robô com referência: mostra, por ativo e no resultado geral, se os sinais acertam mais (e ganham mais) do que comprar em qualquer dia, já descontando o custo da operação, com um veredito claro — supera, igual, pior ou poucos dados.</w:t>
+      </w:r>
+    </w:p>
+    <w:p>
+      <w:pPr>
+        <w:pStyle w:val="Commarcadores"/>
+      </w:pPr>
+      <w:r>
+        <w:t>O robô não executa nenhuma ordem de compra ou venda de verdade em nenhuma corretora - é um apoio técnico à decisão. A palavra final é sempre do investidor.</w:t>
+      </w:r>
+    </w:p>
+    <w:p>
+      <w:pPr>
+        <w:pStyle w:val="Ttulo2"/>
+      </w:pPr>
+      <w:bookmarkStart w:id="11" w:name="_Toc242867150"/>
+      <w:r>
+        <w:t>3.6. Scanner Técnico Avançado</w:t>
+      </w:r>
+      <w:bookmarkEnd w:id="11"/>
+    </w:p>
+    <w:p>
+      <w:r>
+        <w:t>Painel dedicado que combina, para cada ativo em carteira, sete indicadores técnicos num só veredito: IFR (RSI), médias móveis, MACD, volume, suporte e resistência e tendência de curto prazo (todos votando uma direção), mais volatilidade e ATR (Average True Range) como indicadores de risco. Quando os indicadores concordam entre si, o sistema aponta claramente Predomínio de alta ou de baixa; quando discordam, mostra Indicadores conflitantes em vez de forçar uma previsão.</w:t>
+      </w:r>
+    </w:p>
+    <w:p>
+      <w:pPr>
+        <w:pStyle w:val="Commarcadores"/>
+      </w:pPr>
+      <w:r>
+        <w:t>Plano de trade sugerido — entrada, stop, alvo e relação risco-retorno, calculados a partir do suporte/resistência e do ATR, sempre que o veredito tem uma direção clara. Respeita a natureza long-only do sistema: em sinais de baixa, sugere reduzir ou sair da posição, nunca abrir uma venda a descoberto.</w:t>
+      </w:r>
+    </w:p>
+    <w:p>
+      <w:pPr>
+        <w:pStyle w:val="Commarcadores"/>
+      </w:pPr>
+      <w:r>
+        <w:t>Cobre tanto os ativos já comprados quanto os apenas reservados (watchlist), com selo próprio para diferenciar um do outro.</w:t>
+      </w:r>
+    </w:p>
+    <w:p>
+      <w:pPr>
+        <w:pStyle w:val="Commarcadores"/>
+      </w:pPr>
+      <w:r>
+        <w:t>🛑 É uma referência de apoio à leitura técnica - não constitui recomendação de investimento nem previsão de preço.</w:t>
+      </w:r>
+    </w:p>
+    <w:p>
+      <w:pPr>
+        <w:pStyle w:val="Ttulo2"/>
+      </w:pPr>
+      <w:bookmarkStart w:id="12" w:name="_Toc242867151"/>
+      <w:r>
+        <w:t>3.7. Histórico e Gráficos</w:t>
+      </w:r>
+      <w:bookmarkEnd w:id="12"/>
+    </w:p>
+    <w:p>
+      <w:r>
+        <w:t>Página dedicada ao histórico de cotações diárias e ao gráfico de acompanhamento de preço, separada em duas seções: Compradas, com os últimos 30 pregões de cada ativo, e Reservadas, com o gráfico começando exatamente na data em que a reserva foi feita - inclusive as reservas automáticas do robô, também identificadas com o selo próprio. Um filtro permite focar em um único ativo.</w:t>
+      </w:r>
+    </w:p>
+    <w:p>
+      <w:pPr>
+        <w:pStyle w:val="Ttulo2"/>
+      </w:pPr>
+      <w:bookmarkStart w:id="13" w:name="_Toc242867152"/>
+      <w:r>
+        <w:t>3.8. Robô e Alertas - Avisos e Lembretes</w:t>
+      </w:r>
+      <w:bookmarkEnd w:id="13"/>
+    </w:p>
+    <w:p>
+      <w:r>
+        <w:t>O sistema gera avisos automáticos sempre que: uma posição atinge a meta de lucro definida, atinge a meta de perda definida, um ativo passa a mostrar sinal de tendência de mercado, ou o robô consultor identifica um sinal técnico de compra ou de venda. Os alertas de meta e os sinais do robô também disparam um aviso sonoro no navegador, para que o investidor não precise ficar com a tela aberta o tempo todo. Todo dia, o sistema limpa automaticamente os avisos de dias anteriores, mantendo a lista sempre focada no que é relevante agora.</w:t>
+      </w:r>
+    </w:p>
+    <w:p>
+      <w:pPr>
+        <w:pStyle w:val="Ttulo2"/>
+      </w:pPr>
+      <w:bookmarkStart w:id="14" w:name="_Toc242867153"/>
+      <w:r>
         <w:lastRenderedPageBreak/>
-        <w:t>Backtesting do robô com referência: mostra, por ativo e no resultado geral, se os sinais acertam mais (e ganham mais) do que comprar em qualquer dia, já descontando o custo da operação, com um veredito claro — supera, igual, pior ou poucos dados.</w:t>
-      </w:r>
+        <w:t>3.9. Notícias do Mercado</w:t>
+      </w:r>
+      <w:bookmarkEnd w:id="14"/>
+    </w:p>
+    <w:p>
+      <w:r>
+        <w:t>Mural de manchetes de notícias e análises de mercado, com fontes 100% configuráveis pelos administradores do sistema (basta cadastrar a URL de qualquer site de notícias). O botão "Atualizar notícias agora" sincroniza as manchetes que o site está exibindo no momento: grava as novas e remove as que saíram do ar - mantendo a lista sempre fiel ao que o site mostra hoje. Manchetes recém-encontradas ficam destacadas com um selo "Nova" na primeira visita após a atualização. Uma fonte pode ser desativada sem perder o histórico já capturado - ela simplesmente some do mural até ser reativada. Também é possível informar um ativo (ex.: PETR4, Petrobras): as notícias continuam sendo buscadas normalmente e as manchetes que citam aquele ativo ficam destacadas em amarelo, com a contagem por fonte. Os administradores também podem limpar todas as manchetes com um clique para recomeçar o mural do zero.</w:t>
+      </w:r>
+    </w:p>
+    <w:p>
+      <w:pPr>
+        <w:pStyle w:val="Ttulo2"/>
+      </w:pPr>
+      <w:bookmarkStart w:id="15" w:name="_Toc242867154"/>
+      <w:r>
+        <w:t>3.10. TradingView Integrado</w:t>
+      </w:r>
+      <w:bookmarkEnd w:id="15"/>
+    </w:p>
+    <w:p>
+      <w:r>
+        <w:t>O gráfico avançado do TradingView (o mesmo widget oficial usado em milhões de sites financeiros) fica embutido diretamente dentro do sistema, com busca de qualquer ativo e atalhos rápidos para os tickers da carteira do usuário. A página também traz o ranking de maiores altas, baixas e mais negociadas da bolsa brasileira, e um campo de URL configurável (com valor padrão definido pelo administrador) para abrir qualquer outra página do TradingView em uma nova aba.</w:t>
+      </w:r>
+    </w:p>
+    <w:p>
+      <w:pPr>
+        <w:pStyle w:val="Ttulo2"/>
+      </w:pPr>
+      <w:bookmarkStart w:id="16" w:name="_Toc242867155"/>
+      <w:r>
+        <w:t>3.11. Detalhes de Cotações</w:t>
+      </w:r>
+      <w:bookmarkEnd w:id="16"/>
+    </w:p>
+    <w:p>
+      <w:r>
+        <w:t>Grid com o retrato mais recente da cotação de cada ativo cadastrado: preço atual, variação do dia, máxima e mínima do dia, abertura, fechamento anterior, variação em R$, volume negociado, valor de mercado, moeda e faixa de 52 semanas - tudo em um único lugar, sem precisar visitar vários sites.</w:t>
+      </w:r>
+    </w:p>
+    <w:p>
+      <w:r>
+        <w:t>Registros de cotações: a cada atualização - automática, pelo botão "Atualizar cotações agora" ou por uma consulta avulsa - o sistema grava a cotação de cada ativo em carteira, com data, hora e origem (automática ou manual). Um botão nesta tela mostra a grid com esses registros, por ativo ou de toda a carteira. Ao vender um ativo, o sistema pergunta se os registros dele devem ser mantidos ou excluídos.</w:t>
+      </w:r>
+    </w:p>
+    <w:p>
+      <w:pPr>
+        <w:pStyle w:val="Ttulo2"/>
+      </w:pPr>
+      <w:bookmarkStart w:id="17" w:name="_Toc242867156"/>
+      <w:r>
+        <w:t>3.12. Horário de Negociação da B3</w:t>
+      </w:r>
+      <w:bookmarkEnd w:id="17"/>
+    </w:p>
+    <w:p>
+      <w:r>
+        <w:t>O sistema conhece o horário de pregão da B3 (configurável pelo administrador) e mostra, em destaque no Painel, em Posições e em Minhas Operações, se o mercado está aberto ou fechado agora. Fora do horário de negociação, o botão "Atualizar cotações agora" é bloqueado automaticamente, com um aviso explicando o motivo - evitando consumo desnecessário de chamadas à API de cotações quando o preço simplesmente não vai mudar.</w:t>
+      </w:r>
+    </w:p>
+    <w:p>
+      <w:pPr>
+        <w:pStyle w:val="Ttulo2"/>
+      </w:pPr>
+      <w:bookmarkStart w:id="18" w:name="_Toc242867157"/>
+      <w:r>
+        <w:t>3.13. Relatórios e Exportações</w:t>
+      </w:r>
+      <w:bookmarkEnd w:id="18"/>
+    </w:p>
+    <w:p>
+      <w:r>
+        <w:t xml:space="preserve">Todas as telas de dados principais - Minhas Operações, Posições em Carteira e a indicação do robô consultor - têm exportação em Excel (.xlsx) e em PDF, prontas para impressão ou envio a terceiros (contador, sócio, cliente). Os relatórios de Minhas Operações trazem uma seção por grid (Em Carteira, </w:t>
+      </w:r>
+      <w:r>
+        <w:lastRenderedPageBreak/>
+        <w:t>Vendidas, Reservadas), cada uma com o período efetivamente filtrado e uma linha de totais - não são apenas planilhas genéricas, são relatórios financeiros de verdade.</w:t>
+      </w:r>
+    </w:p>
+    <w:p>
+      <w:pPr>
+        <w:pStyle w:val="Ttulo2"/>
+      </w:pPr>
+      <w:bookmarkStart w:id="19" w:name="_Toc242867158"/>
+      <w:r>
+        <w:t>3.14. WhatsApp</w:t>
+      </w:r>
+      <w:bookmarkEnd w:id="19"/>
+    </w:p>
+    <w:p>
+      <w:r>
+        <w:t>Um ícone flutuante de WhatsApp, visível em todas as telas, abre uma conversa direta com o número de contato configurado pelo administrador. Mensagens recebidas nesse número (via integração com a Meta Cloud API) ficam registradas em um mural interno, visível só para os administradores, com validação de assinatura das mensagens recebidas para evitar o recebimento de mensagens forjadas.</w:t>
+      </w:r>
+    </w:p>
+    <w:p>
+      <w:pPr>
+        <w:pStyle w:val="Ttulo2"/>
+      </w:pPr>
+      <w:bookmarkStart w:id="20" w:name="_Toc242867159"/>
+      <w:r>
+        <w:t>3.15. Aplicativo Instalável (PWA)</w:t>
+      </w:r>
+      <w:bookmarkEnd w:id="20"/>
+    </w:p>
+    <w:p>
+      <w:r>
+        <w:t>O BolsaTrader pode ser instalado como aplicativo, direto do navegador, em computadores e celulares, sem precisar de loja de aplicativos. Uma vez instalado, o visual do sistema continua acessível mesmo sem internet (as páginas com dados da carteira exigem conexão, para nunca exibir saldos ou cotações desatualizadas).</w:t>
+      </w:r>
+    </w:p>
+    <w:p>
+      <w:pPr>
+        <w:pStyle w:val="Ttulo2"/>
+      </w:pPr>
+      <w:bookmarkStart w:id="21" w:name="_Toc242867160"/>
+      <w:r>
+        <w:t>3.16. Conta Corrente</w:t>
+      </w:r>
+      <w:bookmarkEnd w:id="21"/>
+    </w:p>
+    <w:p>
+      <w:r>
+        <w:t>Controle financeiro simples e integrado à carteira: saldo inicial informado pelo usuário, débito automático a cada compra registrada e crédito automático a cada venda, além de transferências manuais (por exemplo, um depósito vindo de outro banco). O extrato pode ser filtrado por período e exportado em Excel ou PDF, com saldo inicial, lançamentos do período e saldo final.</w:t>
+      </w:r>
+    </w:p>
+    <w:p>
+      <w:pPr>
+        <w:pStyle w:val="Ttulo2"/>
+      </w:pPr>
+      <w:bookmarkStart w:id="22" w:name="_Toc242867161"/>
+      <w:r>
+        <w:t>3.17. Segurança e Multiusuário</w:t>
+      </w:r>
+      <w:bookmarkEnd w:id="22"/>
     </w:p>
     <w:p>
       <w:pPr>
         <w:pStyle w:val="Commarcadores"/>
       </w:pPr>
       <w:r>
-        <w:t>O robô não executa nenhuma ordem de compra ou venda de verdade em nenhuma corretora - é um apoio técnico à decisão. A palavra final é sempre do investidor.</w:t>
+        <w:t>Cada usuário só acessa suas próprias operações, posições, alertas e exportações - mesmo tentando acessar pelo endereço direto.</w:t>
+      </w:r>
+    </w:p>
+    <w:p>
+      <w:pPr>
+        <w:pStyle w:val="Commarcadores"/>
+      </w:pPr>
+      <w:r>
+        <w:t>O mural de atividade da comunidade nunca revela ativo, quantidade ou preço de ninguém.</w:t>
+      </w:r>
+    </w:p>
+    <w:p>
+      <w:pPr>
+        <w:pStyle w:val="Commarcadores"/>
+      </w:pPr>
+      <w:r>
+        <w:t>Senhas armazenadas com hash seguro (nunca em texto puro).</w:t>
+      </w:r>
+    </w:p>
+    <w:p>
+      <w:pPr>
+        <w:pStyle w:val="Commarcadores"/>
+      </w:pPr>
+      <w:r>
+        <w:t>Encerramento de sessão protegido contra logout indevido por links externos.</w:t>
+      </w:r>
+    </w:p>
+    <w:p>
+      <w:pPr>
+        <w:pStyle w:val="Commarcadores"/>
+      </w:pPr>
+      <w:r>
+        <w:t>Webhook do WhatsApp valida a assinatura das mensagens recebidas.</w:t>
+      </w:r>
+    </w:p>
+    <w:p>
+      <w:pPr>
+        <w:pStyle w:val="Commarcadores"/>
+      </w:pPr>
+      <w:r>
+        <w:t>Perfis de acesso (usuário, administrador e superusuário): o cadastro de novos usuários é controlado pelo administrador, e as funções que afetam todos os usuários ficam restritas a quem tem permissão.</w:t>
+      </w:r>
+    </w:p>
+    <w:p>
+      <w:pPr>
+        <w:pStyle w:val="Commarcadores"/>
+      </w:pPr>
+      <w:r>
+        <w:t>Login da corretora, senha, assinatura eletrônica e token do Telegram gravados criptografados no banco de dados — ilegíveis mesmo para quem tiver acesso ao banco ou a um backup.</w:t>
+      </w:r>
+    </w:p>
+    <w:p>
+      <w:pPr>
+        <w:pStyle w:val="Commarcadores"/>
+      </w:pPr>
+      <w:r>
+        <w:t>Bloqueio automático do login após várias senhas erradas seguidas, contra ataques de força bruta.</w:t>
+      </w:r>
+    </w:p>
+    <w:p>
+      <w:pPr>
+        <w:pStyle w:val="Commarcadores"/>
+      </w:pPr>
+      <w:r>
+        <w:t>Recuperação de senha por e-mail, com link de uso único e validade de 2 horas.</w:t>
+      </w:r>
+    </w:p>
+    <w:p>
+      <w:pPr>
+        <w:pStyle w:val="Commarcadores"/>
+      </w:pPr>
+      <w:r>
+        <w:t>Todas as ações que alteram dados exigem confirmação segura (proteção contra CSRF).</w:t>
       </w:r>
     </w:p>
     <w:p>
       <w:pPr>
         <w:pStyle w:val="Ttulo2"/>
       </w:pPr>
-      <w:bookmarkStart w:id="11" w:name="_Toc242723854"/>
-      <w:r>
-        <w:t>3.6. Scanner Técnico Avançado</w:t>
-      </w:r>
-      <w:bookmarkEnd w:id="11"/>
-    </w:p>
-    <w:p>
-      <w:r>
-        <w:t>Painel dedicado que combina, para cada ativo em carteira, sete indicadores técnicos num só veredito: IFR (RSI), médias móveis, MACD, volume, suporte e resistência e tendência de curto prazo (todos votando uma direção), mais volatilidade e ATR (Average True Range) como indicadores de risco. Quando os indicadores concordam entre si, o sistema aponta claramente Predomínio de alta ou de baixa; quando discordam, mostra Indicadores conflitantes em vez de forçar uma previsão.</w:t>
-      </w:r>
-    </w:p>
-    <w:p>
-      <w:pPr>
-        <w:pStyle w:val="Commarcadores"/>
-      </w:pPr>
-      <w:r>
-        <w:t>Plano de trade sugerido — entrada, stop, alvo e relação risco-retorno, calculados a partir do suporte/resistência e do ATR, sempre que o veredito tem uma direção clara. Respeita a natureza long-only do sistema: em sinais de baixa, sugere reduzir ou sair da posição, nunca abrir uma venda a descoberto.</w:t>
-      </w:r>
-    </w:p>
-    <w:p>
-      <w:pPr>
-        <w:pStyle w:val="Commarcadores"/>
-      </w:pPr>
-      <w:r>
-        <w:t>Cobre tanto os ativos já comprados quanto os apenas reservados (watchlist), com selo próprio para diferenciar um do outro.</w:t>
-      </w:r>
-    </w:p>
-    <w:p>
-      <w:pPr>
-        <w:pStyle w:val="Commarcadores"/>
-      </w:pPr>
-      <w:r>
-        <w:t>🛑</w:t>
-      </w:r>
-      <w:r>
-        <w:t xml:space="preserve"> É uma referência de apoio à leitura técnica - não constitui recomendação de investimento nem previsão de preço.</w:t>
+      <w:bookmarkStart w:id="23" w:name="_Toc242867162"/>
+      <w:r>
+        <w:lastRenderedPageBreak/>
+        <w:t>3.18. Módulo de Criptomoedas</w:t>
+      </w:r>
+      <w:bookmarkEnd w:id="23"/>
+    </w:p>
+    <w:p>
+      <w:r>
+        <w:t>Carteira de criptomoedas independente das ações da B3, com a mesma qualidade de acompanhamento: cotações de BTC, ETH e outras moedas atualizadas sob demanda, registro de compra, venda e reserva com até 8 casas decimais de precisão, gráfico de variação diária da carteira, integração automática com a Conta Corrente e relatórios em Excel e PDF. Roda 24 horas por dia, todos os dias, sem o horário de pregão da B3 — e não é misturado com as posições, o robô consultor nem o Scanner Técnico das ações, mantendo cada carteira com sua própria lógica e seus próprios números.</w:t>
       </w:r>
     </w:p>
     <w:p>
       <w:pPr>
         <w:pStyle w:val="Ttulo2"/>
       </w:pPr>
-      <w:bookmarkStart w:id="12" w:name="_Toc242723855"/>
-      <w:r>
-        <w:t>3.7. Histórico e Gráficos</w:t>
-      </w:r>
-      <w:bookmarkEnd w:id="12"/>
-    </w:p>
-    <w:p>
-      <w:r>
-        <w:t>Página dedicada ao histórico de cotações diárias e ao gráfico de acompanhamento de preço, separada em duas seções: Compradas, com os últimos 30 pregões de cada ativo, e Reservadas, com o gráfico começando exatamente na data em que a reserva foi feita - inclusive as reservas automáticas do robô, também identificadas com o selo próprio. Um filtro permite focar em um único ativo.</w:t>
+      <w:bookmarkStart w:id="24" w:name="_Toc242867163"/>
+      <w:r>
+        <w:t>3.19. Comando de Voz</w:t>
+      </w:r>
+      <w:bookmarkEnd w:id="24"/>
+    </w:p>
+    <w:p>
+      <w:r>
+        <w:t>Um botão 🎤 no cabeçalho de todas as telas permite usar o sistema falando em português: "abrir posições", "nova operação", "atualizar cotações", "cotação de PETR4" e dezenas de outros comandos. Funciona direto no navegador (Chrome e Edge, inclusive no celular), sem instalar nada e sem custo de API, com retorno visual do que foi entendido e um comando "ajuda" que lista as opções.</w:t>
       </w:r>
     </w:p>
     <w:p>
       <w:pPr>
         <w:pStyle w:val="Ttulo2"/>
       </w:pPr>
-      <w:bookmarkStart w:id="13" w:name="_Toc242723856"/>
-      <w:r>
-        <w:t>3.8. Robô e Alertas - Avisos e Lembretes</w:t>
-      </w:r>
-      <w:bookmarkEnd w:id="13"/>
-    </w:p>
-    <w:p>
-      <w:r>
-        <w:t>O sistema gera avisos automáticos sempre que: uma posição atinge a meta de lucro definida, atinge a meta de perda definida, um ativo passa a mostrar sinal de tendência de mercado, ou o robô consultor identifica um sinal técnico de compra ou de venda. Os alertas de meta e os sinais do robô também disparam um aviso sonoro no navegador, para que o investidor não precise ficar com a tela aberta o tempo todo. Todo dia, o sistema limpa automaticamente os avisos de dias anteriores, mantendo a lista sempre focada n</w:t>
-      </w:r>
-      <w:r>
-        <w:t>o que é relevante agora.</w:t>
-      </w:r>
-    </w:p>
-    <w:p>
-      <w:pPr>
-        <w:pStyle w:val="Ttulo2"/>
-      </w:pPr>
-      <w:bookmarkStart w:id="14" w:name="_Toc242723857"/>
-      <w:r>
-        <w:t>3.9. Notícias do Mercado</w:t>
-      </w:r>
-      <w:bookmarkEnd w:id="14"/>
-    </w:p>
-    <w:p>
-      <w:r>
-        <w:t xml:space="preserve">Mural de manchetes de notícias e análises de mercado, com fontes 100% configuráveis pelos administradores do sistema (basta cadastrar a URL de qualquer site de notícias). O botão "Atualizar notícias agora" sincroniza as manchetes que o site está exibindo no momento: grava as novas e remove </w:t>
-      </w:r>
-      <w:r>
-        <w:lastRenderedPageBreak/>
-        <w:t>as que saíram do ar - mantendo a lista sempre fiel ao que o site mostra hoje. Manchetes recém-encontradas ficam destacadas com um selo "Nova" na primeira visita após a atualização. Uma fonte pode ser desativada sem perder o histórico já capturado - ela simplesmente some do mural até ser reativada. Também é possível informar um ativo (ex.: PETR4, Petrobras): as notícias continuam sendo buscadas normalmente e as manchetes que citam aquele ativo ficam destacadas em amarelo, com a contagem por fonte.</w:t>
-      </w:r>
-    </w:p>
-    <w:p>
-      <w:pPr>
-        <w:pStyle w:val="Ttulo2"/>
-      </w:pPr>
-      <w:bookmarkStart w:id="15" w:name="_Toc242723858"/>
-      <w:r>
-        <w:t>3.10. TradingView Integrado</w:t>
-      </w:r>
-      <w:bookmarkEnd w:id="15"/>
-    </w:p>
-    <w:p>
-      <w:r>
-        <w:t>O gráfico avançado do TradingView (o mesmo widget oficial usado em milhões de sites financeiros) fica embutido diretamente dentro do sistema, com busca de qualquer ativo e atalhos rápidos para os tickers da carteira do usuário. A página também traz o ranking de maiores altas, baixas e mais negociadas da bolsa brasileira, e um campo de URL configurável (com valor padrão definido pelo administrador) para abrir qualquer outra página do TradingView em uma nova aba.</w:t>
-      </w:r>
-    </w:p>
-    <w:p>
-      <w:pPr>
-        <w:pStyle w:val="Ttulo2"/>
-      </w:pPr>
-      <w:bookmarkStart w:id="16" w:name="_Toc242723859"/>
-      <w:r>
-        <w:t>3.11. Detalhes de Cotações</w:t>
-      </w:r>
-      <w:bookmarkEnd w:id="16"/>
-    </w:p>
-    <w:p>
-      <w:r>
-        <w:t>Grid com o retrato mais recente da cotação de cada ativo cadastrado: preço atual, variação do dia, máxima e mínima do dia, abertura, fechamento anterior, variação em R$, volume negociado, valor de mercado, moeda e faixa de 52 semanas - tudo em um único lugar, sem precisar visitar vários sites.</w:t>
-      </w:r>
-    </w:p>
-    <w:p>
-      <w:r>
-        <w:t>Registros de cotações: a cada atualização - automática, pelo botão "Atualizar cotações agora" ou por uma consulta avulsa - o sistema grava a cotação de cada ativo em carteira, com data, hora e origem (automática ou manual). Um botão nesta tela mostra a grid com esses registros, por ativo ou de toda a carteira. Ao vender um ativo, o sistema pergunta se os registros dele devem ser mantidos ou excluídos.</w:t>
-      </w:r>
-    </w:p>
-    <w:p>
-      <w:pPr>
-        <w:pStyle w:val="Ttulo2"/>
-      </w:pPr>
-      <w:bookmarkStart w:id="17" w:name="_Toc242723860"/>
-      <w:r>
-        <w:t>3.12. Horário de Negociação da B3</w:t>
-      </w:r>
-      <w:bookmarkEnd w:id="17"/>
-    </w:p>
-    <w:p>
-      <w:r>
-        <w:t>O sistema conhece o horário de pregão da B3 (configurável pelo administrador) e mostra, em destaque no Painel, em Posições e em Minhas Operações, se o mercado está aberto ou fechado agora. Fora do horário de negociação, o botão "Atualizar cotações agora" é bloqueado automaticamente, com um aviso explicando o motivo - evitando consumo desnecessário de chamadas à API de cotações quando o preço simplesmente não vai mudar.</w:t>
-      </w:r>
-    </w:p>
-    <w:p>
-      <w:pPr>
-        <w:pStyle w:val="Ttulo2"/>
-      </w:pPr>
-      <w:bookmarkStart w:id="18" w:name="_Toc242723861"/>
-      <w:r>
-        <w:t>3.13. Relatórios e Exportações</w:t>
-      </w:r>
-      <w:bookmarkEnd w:id="18"/>
-    </w:p>
-    <w:p>
-      <w:r>
-        <w:t>Todas as telas de dados principais - Minhas Operações, Posições em Carteira e a indicação do robô consultor - têm exportação em Excel (.xlsx) e em PDF, prontas para impressão ou envio a terceiros (contador, sócio, cliente). Os relatórios de Minhas Operações trazem uma seção por grid (Em Carteira, Vendidas, Reservadas), cada uma com o período efetivamente filtrado e uma linha de totais - não são apenas planilhas genéricas, são relatórios financeiros de verdade.</w:t>
-      </w:r>
-    </w:p>
-    <w:p>
-      <w:pPr>
-        <w:pStyle w:val="Ttulo2"/>
-      </w:pPr>
-      <w:bookmarkStart w:id="19" w:name="_Toc242723862"/>
-      <w:r>
-        <w:lastRenderedPageBreak/>
-        <w:t>3.14. WhatsApp</w:t>
-      </w:r>
-      <w:bookmarkEnd w:id="19"/>
-    </w:p>
-    <w:p>
-      <w:r>
-        <w:t>Um ícone flutuante de WhatsApp, visível em todas as telas, abre uma conversa direta com o número de contato configurado pelo administrador. Mensagens recebidas nesse número (via integração com a Meta Cloud API) ficam registradas em um mural interno, visível só para os administradores, com validação de assinatura das mensagens recebidas para evitar o recebimento de mensagens forjadas.</w:t>
-      </w:r>
-    </w:p>
-    <w:p>
-      <w:pPr>
-        <w:pStyle w:val="Ttulo2"/>
-      </w:pPr>
-      <w:bookmarkStart w:id="20" w:name="_Toc242723863"/>
-      <w:r>
-        <w:t>3.15. Aplicativo Instalável (PWA)</w:t>
-      </w:r>
-      <w:bookmarkEnd w:id="20"/>
-    </w:p>
-    <w:p>
-      <w:r>
-        <w:t>O BolsaTrader pode ser instalado como aplicativo, direto do navegador, em computadores e celulares, sem precisar de loja de aplicativos. Uma vez instalado, o visual do sistema continua acessível mesmo sem internet (as páginas com dados da carteira exigem conexão, para nunca exibir saldos ou cotações desatualizadas).</w:t>
-      </w:r>
-    </w:p>
-    <w:p>
-      <w:pPr>
-        <w:pStyle w:val="Ttulo2"/>
-      </w:pPr>
-      <w:bookmarkStart w:id="21" w:name="_Toc242723864"/>
-      <w:r>
-        <w:t>3.16. Conta Corrente</w:t>
-      </w:r>
-      <w:bookmarkEnd w:id="21"/>
-    </w:p>
-    <w:p>
-      <w:r>
-        <w:t>Controle financeiro simples e integrado à carteira: saldo inicial informado pelo usuário, débito automático a cada compra registrada e crédito automático a cada venda, além de transferências manuais (por exemplo, um depósito vindo de outro banco). O extrato pode ser filtrado por período e exportado em Excel ou PDF, com saldo inicial, lançamentos do período e saldo final.</w:t>
-      </w:r>
-    </w:p>
-    <w:p>
-      <w:pPr>
-        <w:pStyle w:val="Ttulo2"/>
-      </w:pPr>
-      <w:bookmarkStart w:id="22" w:name="_Toc242723865"/>
-      <w:r>
-        <w:t>3.17. Segurança e Multiusuário</w:t>
-      </w:r>
-      <w:bookmarkEnd w:id="22"/>
-    </w:p>
-    <w:p>
-      <w:pPr>
-        <w:pStyle w:val="Commarcadores"/>
-      </w:pPr>
-      <w:r>
-        <w:t>Cada usuário só acessa suas próprias operações, posições, alertas e exportações - mesmo tentando acessar pelo endereço direto.</w:t>
-      </w:r>
-    </w:p>
-    <w:p>
-      <w:pPr>
-        <w:pStyle w:val="Commarcadores"/>
-      </w:pPr>
-      <w:r>
-        <w:t>O mural de atividade da comunidade nunca revela ativo, quantidade ou preço de ninguém.</w:t>
-      </w:r>
-    </w:p>
-    <w:p>
-      <w:pPr>
-        <w:pStyle w:val="Commarcadores"/>
-      </w:pPr>
-      <w:r>
-        <w:t>Senhas armazenadas com hash seguro (nunca em texto puro).</w:t>
-      </w:r>
-    </w:p>
-    <w:p>
-      <w:pPr>
-        <w:pStyle w:val="Commarcadores"/>
-      </w:pPr>
-      <w:r>
-        <w:t>Encerramento de sessão protegido contra logout indevido por links externos.</w:t>
-      </w:r>
-    </w:p>
-    <w:p>
-      <w:pPr>
-        <w:pStyle w:val="Commarcadores"/>
-      </w:pPr>
-      <w:r>
-        <w:t>Webhook do WhatsApp valida a assinatura das mensagens recebidas.</w:t>
-      </w:r>
-    </w:p>
-    <w:p>
-      <w:pPr>
-        <w:pStyle w:val="Commarcadores"/>
-      </w:pPr>
-      <w:r>
-        <w:t>Perfis de acesso (usuário, administrador e superusuário): o cadastro de novos usuários é controlado pelo administrador, e as funções que afetam todos os usuários ficam restritas a quem tem permissão.</w:t>
-      </w:r>
-    </w:p>
-    <w:p>
-      <w:pPr>
-        <w:pStyle w:val="Commarcadores"/>
-      </w:pPr>
-      <w:r>
-        <w:t>Login da corretora, senha, assinatura eletrônica e token do Telegram gravados criptografados no banco de dados — ilegíveis mesmo para quem tiver acesso ao banco ou a um backup.</w:t>
-      </w:r>
-    </w:p>
-    <w:p>
-      <w:pPr>
-        <w:pStyle w:val="Commarcadores"/>
-      </w:pPr>
-      <w:r>
-        <w:t>Bloqueio automático do login após várias senhas erradas seguidas, contra ataques de força bruta.</w:t>
-      </w:r>
-    </w:p>
-    <w:p>
-      <w:pPr>
-        <w:pStyle w:val="Commarcadores"/>
-      </w:pPr>
-      <w:r>
-        <w:t>Recuperação de senha por e-mail, com link de uso único e validade de 2 horas.</w:t>
-      </w:r>
-    </w:p>
-    <w:p>
-      <w:pPr>
-        <w:pStyle w:val="Commarcadores"/>
-      </w:pPr>
-      <w:r>
-        <w:t>Todas as ações que alteram dados exigem confirmação segura (proteção contra CSRF).</w:t>
-      </w:r>
-    </w:p>
-    <w:p>
-      <w:pPr>
-        <w:pStyle w:val="Ttulo2"/>
-      </w:pPr>
-      <w:bookmarkStart w:id="23" w:name="_Toc242723866"/>
-      <w:r>
-        <w:t>3.18. Módulo de Criptomoedas</w:t>
-      </w:r>
-      <w:bookmarkEnd w:id="23"/>
-    </w:p>
-    <w:p>
-      <w:r>
-        <w:t xml:space="preserve">Carteira de criptomoedas independente das ações da B3, com a mesma qualidade de acompanhamento: cotações de BTC, ETH e outras moedas atualizadas sob demanda, registro de compra, venda e reserva com até 8 casas decimais de precisão, gráfico de variação diária da carteira, integração automática com a Conta Corrente e relatórios em Excel e PDF. Roda 24 horas por dia, todos os dias, sem o horário de </w:t>
-      </w:r>
-      <w:r>
-        <w:lastRenderedPageBreak/>
-        <w:t>pregão da B3 — e não é misturado com as posições, o robô consultor nem o Scanner Técnico das ações, mantendo cada carteira com sua própria lógica e seus próprios números.</w:t>
-      </w:r>
-    </w:p>
-    <w:p>
-      <w:pPr>
-        <w:pStyle w:val="Ttulo2"/>
-      </w:pPr>
-      <w:bookmarkStart w:id="24" w:name="_Toc242723867"/>
-      <w:r>
-        <w:t>3.19. Comando de Voz</w:t>
-      </w:r>
-      <w:bookmarkEnd w:id="24"/>
-    </w:p>
-    <w:p>
-      <w:r>
-        <w:t xml:space="preserve">Um botão </w:t>
-      </w:r>
-      <w:r>
-        <w:t>🎤</w:t>
-      </w:r>
-      <w:r>
-        <w:t xml:space="preserve"> no cabeçalho de todas as telas permite usar o sistema falando em português: "abrir posições", "nova operação", "atualizar cotações", "cotação de PETR4" e dezenas de outros comandos. Funciona direto no navegador (Chrome e Edge, inclusive no celular), sem instalar nada e sem custo de API, com retorno visual do que foi entendido e um comando "ajuda" que lista as opções.</w:t>
-      </w:r>
-    </w:p>
-    <w:p>
-      <w:pPr>
-        <w:pStyle w:val="Ttulo2"/>
-      </w:pPr>
-      <w:bookmarkStart w:id="25" w:name="_Toc242723868"/>
+      <w:bookmarkStart w:id="25" w:name="_Toc242867164"/>
       <w:r>
         <w:t>3.20. Qualidade das Empresas</w:t>
       </w:r>
@@ -3126,7 +3374,7 @@
       <w:pPr>
         <w:pStyle w:val="Ttulo2"/>
       </w:pPr>
-      <w:bookmarkStart w:id="26" w:name="_Toc242723869"/>
+      <w:bookmarkStart w:id="26" w:name="_Toc242867165"/>
       <w:r>
         <w:t>3.21. Calculadora de Risco</w:t>
       </w:r>
@@ -3194,6 +3442,64 @@
       </w:r>
     </w:p>
     <w:p>
+      <w:pPr>
+        <w:pStyle w:val="Ttulo2"/>
+      </w:pPr>
+      <w:bookmarkStart w:id="27" w:name="_Toc242867166"/>
+      <w:r>
+        <w:lastRenderedPageBreak/>
+        <w:t>3.22. Risco da Carteira</w:t>
+      </w:r>
+      <w:bookmarkEnd w:id="27"/>
+    </w:p>
+    <w:p>
+      <w:r>
+        <w:t>Diversificar não é ter muitos tickers: oito ações que sobem e caem juntas protegem tanto quanto uma. Na aba Indicadores de risco, o sistema olha a carteira como um todo — tudo calculado com o histórico já salvo, sem custo extra de API.</w:t>
+      </w:r>
+    </w:p>
+    <w:p>
+      <w:pPr>
+        <w:pStyle w:val="Commarcadores"/>
+      </w:pPr>
+      <w:r>
+        <w:rPr>
+          <w:b/>
+        </w:rPr>
+        <w:t>Composição:</w:t>
+      </w:r>
+      <w:r>
+        <w:t xml:space="preserve"> gráfico de rosca com o peso de cada ativo, as maiores posições em destaque.</w:t>
+      </w:r>
+    </w:p>
+    <w:p>
+      <w:pPr>
+        <w:pStyle w:val="Commarcadores"/>
+      </w:pPr>
+      <w:r>
+        <w:rPr>
+          <w:b/>
+        </w:rPr>
+        <w:t>Correlação:</w:t>
+      </w:r>
+      <w:r>
+        <w:t xml:space="preserve"> mapa de calor de quanto cada par de ativos anda junto, com a correlação média e um aviso dos pares que não diversificam.</w:t>
+      </w:r>
+    </w:p>
+    <w:p>
+      <w:pPr>
+        <w:pStyle w:val="Commarcadores"/>
+      </w:pPr>
+      <w:r>
+        <w:rPr>
+          <w:b/>
+        </w:rPr>
+        <w:t>Teste de estresse:</w:t>
+      </w:r>
+      <w:r>
+        <w:t xml:space="preserve"> beta da carteira contra o Ibovespa, perda estimada em % e em R$ numa queda de 10%, 20% ou 30% do mercado, e o pior dia, semana e mês que a carteira atual teria tido no último ano.</w:t>
+      </w:r>
+    </w:p>
+    <w:p>
       <w:r>
         <w:br w:type="page"/>
       </w:r>
@@ -3202,12 +3508,12 @@
       <w:pPr>
         <w:pStyle w:val="Ttulo1"/>
       </w:pPr>
-      <w:bookmarkStart w:id="27" w:name="_Toc242723870"/>
+      <w:bookmarkStart w:id="28" w:name="_Toc242867167"/>
       <w:r>
         <w:lastRenderedPageBreak/>
         <w:t>4. Requisitos Técnicos e Modelo de Implantação</w:t>
       </w:r>
-      <w:bookmarkEnd w:id="27"/>
+      <w:bookmarkEnd w:id="28"/>
     </w:p>
     <w:p>
       <w:r>
@@ -3303,12 +3609,12 @@
       <w:pPr>
         <w:pStyle w:val="Ttulo1"/>
       </w:pPr>
-      <w:bookmarkStart w:id="28" w:name="_Toc242723871"/>
+      <w:bookmarkStart w:id="29" w:name="_Toc242867168"/>
       <w:r>
         <w:lastRenderedPageBreak/>
         <w:t>5. Aviso Legal</w:t>
       </w:r>
-      <w:bookmarkEnd w:id="28"/>
+      <w:bookmarkEnd w:id="29"/>
     </w:p>
     <w:p>
       <w:pPr>
@@ -3322,10 +3628,7 @@
         <w:spacing w:before="120" w:after="200"/>
       </w:pPr>
       <w:r>
-        <w:t>⚠</w:t>
-      </w:r>
-      <w:r>
-        <w:t xml:space="preserve"> O BolsaTrader é uma ferramenta de acompanhamento e apoio à decisão. Os indicadores, sinais, alertas, sugestões do robô consultor, notas de Qualidade das Empresas e sugestões da Calculadora de risco apresentados pelo sistema são referências técnicas calculadas a partir de dados históricos de mercado e NÃO constituem recomendação de investimento. O robô consultor não executa nenhuma ordem de compra ou venda de verdade em nenhuma corretora - toda decisão final é de responsabilidade exclusiva do investidor.</w:t>
+        <w:t>⚠ O BolsaTrader é uma ferramenta de acompanhamento e apoio à decisão. Os indicadores, sinais, alertas, sugestões do robô consultor, notas de Qualidade das Empresas e sugestões da Calculadora de risco apresentados pelo sistema são referências técnicas calculadas a partir de dados históricos de mercado e NÃO constituem recomendação de investimento. O robô consultor não executa nenhuma ordem de compra ou venda de verdade em nenhuma corretora - toda decisão final é de responsabilidade exclusiva do investidor.</w:t>
       </w:r>
     </w:p>
     <w:p>
@@ -3337,12 +3640,12 @@
       <w:pPr>
         <w:pStyle w:val="Ttulo1"/>
       </w:pPr>
-      <w:bookmarkStart w:id="29" w:name="_Toc242723872"/>
+      <w:bookmarkStart w:id="30" w:name="_Toc242867169"/>
       <w:r>
         <w:lastRenderedPageBreak/>
         <w:t>6. Próximos Passos</w:t>
       </w:r>
-      <w:bookmarkEnd w:id="29"/>
+      <w:bookmarkEnd w:id="30"/>
     </w:p>
     <w:p>
       <w:r>
@@ -3361,10 +3664,7 @@
         <w:spacing w:before="120" w:after="200"/>
       </w:pPr>
       <w:r>
-        <w:t>💡</w:t>
-      </w:r>
-      <w:r>
-        <w:t xml:space="preserve"> Este documento pode ser adaptado com a identidade visual, condições comerciais e dados de contato específicos de quem for apresentar ou revender o sistema.</w:t>
+        <w:t>💡 Este documento pode ser adaptado com a identidade visual, condições comerciais e dados de contato específicos de quem for apresentar ou revender o sistema.</w:t>
       </w:r>
     </w:p>
     <w:sectPr>

</xml_diff>

<commit_message>
Atualiza manuais e apresentacao com os avisos de compra pelo Telegram
- Manual operacional: nova 15.5 (Avisos pelo Telegram) e entrada no
  sumario; tipos de alerta novos na 15.1; notas em 2.3, 7.3, 8.3 e 18.2;
  TELEGRAM_IA_DIARIA(_HORA) na secao 19; 2 FAQs
- Manual comercial: diferencial, itens em 3.4 e 3.6 e nova secao 3.23
- Apresentacao: slide novo "Mensagens de compra no celular" (31 slides)

Co-Authored-By: Claude Opus 5.5 <noreply@anthropic.com>
</commit_message>
<xml_diff>
--- a/docs/Manual_Comercial_BolsaTrader.docx
+++ b/docs/Manual_Comercial_BolsaTrader.docx
@@ -73,7 +73,7 @@
           <w:color w:val="5A6474"/>
           <w:sz w:val="20"/>
         </w:rPr>
-        <w:t>Versão do manual: outubro de 2026 — revisão de 14/10/2026 (Correlação e teste de estresse da carteira, gráfico de composição e limpeza do mural de notícias)</w:t>
+        <w:t xml:space="preserve">Versão do manual: outubro de 2026 — revisão de 14/10/2026 (Mensagens de compra pelo Telegram: Scanner Técnico, robô consultor, reserva atingida e IA do dia)</w:t>
       </w:r>
     </w:p>
     <w:p>
@@ -2216,6 +2216,81 @@
     </w:p>
     <w:p>
       <w:pPr>
+        <w:pStyle w:val="Sumrio2"/>
+        <w:tabs>
+          <w:tab w:val="right" w:leader="dot" w:pos="9396"/>
+        </w:tabs>
+        <w:rPr>
+          <w:rFonts w:asciiTheme="minorHAnsi" w:hAnsiTheme="minorHAnsi"/>
+          <w:noProof/>
+          <w:color w:val="auto"/>
+          <w:kern w:val="2"/>
+          <w:sz w:val="24"/>
+          <w:szCs w:val="24"/>
+          <w:lang w:val="pt-BR" w:eastAsia="pt-BR"/>
+          <w14:ligatures w14:val="standardContextual"/>
+        </w:rPr>
+      </w:pPr>
+      <w:hyperlink w:anchor="_Toc900000323" w:history="1">
+        <w:r>
+          <w:rPr>
+            <w:rStyle w:val="Hyperlink"/>
+            <w:noProof/>
+          </w:rPr>
+          <w:t>3.23. Mensagens de Compra pelo Telegram</w:t>
+        </w:r>
+        <w:r>
+          <w:rPr>
+            <w:noProof/>
+            <w:webHidden/>
+          </w:rPr>
+          <w:tab/>
+        </w:r>
+        <w:r>
+          <w:rPr>
+            <w:noProof/>
+            <w:webHidden/>
+          </w:rPr>
+          <w:fldChar w:fldCharType="begin"/>
+        </w:r>
+        <w:r>
+          <w:rPr>
+            <w:noProof/>
+            <w:webHidden/>
+          </w:rPr>
+          <w:instrText xml:space="preserve"> PAGEREF _Toc900000323 \h </w:instrText>
+        </w:r>
+        <w:r>
+          <w:rPr>
+            <w:noProof/>
+            <w:webHidden/>
+          </w:rPr>
+        </w:r>
+        <w:r>
+          <w:rPr>
+            <w:noProof/>
+            <w:webHidden/>
+          </w:rPr>
+          <w:fldChar w:fldCharType="separate"/>
+        </w:r>
+        <w:r>
+          <w:rPr>
+            <w:noProof/>
+            <w:webHidden/>
+          </w:rPr>
+          <w:t>13</w:t>
+        </w:r>
+        <w:r>
+          <w:rPr>
+            <w:noProof/>
+            <w:webHidden/>
+          </w:rPr>
+          <w:fldChar w:fldCharType="end"/>
+        </w:r>
+      </w:hyperlink>
+    </w:p>
+    <w:p>
+      <w:pPr>
         <w:pStyle w:val="Sumrio1"/>
         <w:tabs>
           <w:tab w:val="right" w:leader="dot" w:pos="9396"/>
@@ -2502,7 +2577,7 @@
         <w:pStyle w:val="Commarcadores"/>
       </w:pPr>
       <w:r>
-        <w:t>Avisa o investidor no momento certo - por alerta na tela, som e, opcionalmente, WhatsApp - em vez de exigir que ele fique checando o sistema o dia inteiro.</w:t>
+        <w:t xml:space="preserve">Avisa o investidor no momento certo - por alerta na tela, som, mensagem no Telegram e, opcionalmente, WhatsApp - em vez de exigir que ele fique checando o sistema o dia inteiro.</w:t>
       </w:r>
     </w:p>
     <w:p>
@@ -2669,6 +2744,14 @@
       </w:r>
     </w:p>
     <w:p>
+      <w:pPr>
+        <w:pStyle w:val="Commarcadores"/>
+      </w:pPr>
+      <w:r>
+        <w:t xml:space="preserve">Mensagens de compra no celular pelo Telegram: o Scanner avisa quando a cotação chega à entrada do plano de trade, o robô avisa o sinal de compra, a reserva avisa quando o preço chega ao valor reservado, e a análise e as sugestões do dia por IA chegam sozinhas — sem precisar ficar com o sistema aberto.</w:t>
+      </w:r>
+    </w:p>
+    <w:p>
       <w:r>
         <w:br w:type="page"/>
       </w:r>
@@ -2926,6 +3009,14 @@
         <w:pStyle w:val="Commarcadores"/>
       </w:pPr>
       <w:r>
+        <w:t xml:space="preserve">Sugestões de hoje por IA — de 3 a 5 ativos entre as maiores altas e baixas do dia que merecem atenção. Análise e sugestões podem ser enviadas pelo Telegram, ao clicar e também sozinhas uma vez por dia útil.</w:t>
+      </w:r>
+    </w:p>
+    <w:p>
+      <w:pPr>
+        <w:pStyle w:val="Commarcadores"/>
+      </w:pPr>
+      <w:r>
         <w:t>Relatório de indicação do robô, exportável em Excel e em PDF, com o sinal atual de cada ativo, se ele já está em carteira, e os votos de cada indicador.</w:t>
       </w:r>
     </w:p>
@@ -3022,6 +3113,14 @@
       </w:pPr>
       <w:r>
         <w:t>Cobre tanto os ativos já comprados quanto os apenas reservados (watchlist), com selo próprio para diferenciar um do outro.</w:t>
+      </w:r>
+    </w:p>
+    <w:p>
+      <w:pPr>
+        <w:pStyle w:val="Commarcadores"/>
+      </w:pPr>
+      <w:r>
+        <w:t xml:space="preserve">Aviso de compra pelo Telegram quando o ativo está em predomínio de alta e a cotação está na entrada do plano ou abaixo, com entrada, stop, alvo e relação risco-retorno na própria mensagem.</w:t>
       </w:r>
     </w:p>
     <w:p>
@@ -3497,6 +3596,106 @@
       </w:r>
       <w:r>
         <w:t xml:space="preserve"> beta da carteira contra o Ibovespa, perda estimada em % e em R$ numa queda de 10%, 20% ou 30% do mercado, e o pior dia, semana e mês que a carteira atual teria tido no último ano.</w:t>
+      </w:r>
+    </w:p>
+    <w:p>
+      <w:pPr>
+        <w:pStyle w:val="Ttulo2"/>
+      </w:pPr>
+      <w:bookmarkStart w:id="900323" w:name="_Toc900000323"/>
+      <w:r>
+        <w:lastRenderedPageBreak/>
+        <w:t xml:space="preserve">3.23. Mensagens de Compra pelo Telegram</w:t>
+      </w:r>
+      <w:bookmarkEnd w:id="900323"/>
+    </w:p>
+    <w:p>
+      <w:r>
+        <w:t xml:space="preserve">Cada usuário liga o próprio bot do Telegram na tela Minha Conta e passa a receber no celular as oportunidades de compra que o sistema identifica, no momento em que acontecem — o token fica gravado criptografado.</w:t>
+      </w:r>
+    </w:p>
+    <w:p>
+      <w:pPr>
+        <w:pStyle w:val="Commarcadores"/>
+      </w:pPr>
+      <w:r>
+        <w:rPr>
+          <w:b/>
+        </w:rPr>
+        <w:t xml:space="preserve">Scanner Técnico:</w:t>
+      </w:r>
+      <w:r>
+        <w:t xml:space="preserve"> predomínio de alta com a cotação na entrada do plano de trade ou abaixo, já com stop, alvo e relação risco-retorno.</w:t>
+      </w:r>
+    </w:p>
+    <w:p>
+      <w:pPr>
+        <w:pStyle w:val="Commarcadores"/>
+      </w:pPr>
+      <w:r>
+        <w:rPr>
+          <w:b/>
+        </w:rPr>
+        <w:t xml:space="preserve">Robô consultor:</w:t>
+      </w:r>
+      <w:r>
+        <w:t xml:space="preserve"> o sinal técnico de compra (RSI + MACD + tendência).</w:t>
+      </w:r>
+    </w:p>
+    <w:p>
+      <w:pPr>
+        <w:pStyle w:val="Commarcadores"/>
+      </w:pPr>
+      <w:r>
+        <w:rPr>
+          <w:b/>
+        </w:rPr>
+        <w:t xml:space="preserve">Reserva atingida:</w:t>
+      </w:r>
+      <w:r>
+        <w:t xml:space="preserve"> a cotação caiu até o preço que o investidor reservou.</w:t>
+      </w:r>
+    </w:p>
+    <w:p>
+      <w:pPr>
+        <w:pStyle w:val="Commarcadores"/>
+      </w:pPr>
+      <w:r>
+        <w:rPr>
+          <w:b/>
+        </w:rPr>
+        <w:t xml:space="preserve">Inteligência Artificial:</w:t>
+      </w:r>
+      <w:r>
+        <w:t xml:space="preserve"> a Análise da B3 hoje (ativos em alta) e as Sugestões de hoje, enviadas ao clicar e automaticamente uma vez por dia útil, em horário configurável.</w:t>
+      </w:r>
+    </w:p>
+    <w:p>
+      <w:pPr>
+        <w:pStyle w:val="Commarcadores"/>
+      </w:pPr>
+      <w:r>
+        <w:rPr>
+          <w:b/>
+        </w:rPr>
+        <w:t xml:space="preserve">Meta de lucro:</w:t>
+      </w:r>
+      <w:r>
+        <w:t xml:space="preserve"> atingida em uma posição comprada.</w:t>
+      </w:r>
+    </w:p>
+    <w:p>
+      <w:pPr>
+        <w:pStyle w:val="Commarcadores"/>
+      </w:pPr>
+      <w:r>
+        <w:rPr>
+          <w:b/>
+        </w:rPr>
+        <w:t xml:space="preserve">Sem excesso de mensagens:</w:t>
+      </w:r>
+      <w:r>
+        <w:t xml:space="preserve"> cada ativo é avisado no máximo uma vez por dia. O sistema não executa ordens — a decisão de comprar continua sendo do investidor.</w:t>
       </w:r>
     </w:p>
     <w:p>

</xml_diff>